<commit_message>
segmented serial version done
</commit_message>
<xml_diff>
--- a/documentation/Primes.docx
+++ b/documentation/Primes.docx
@@ -2355,9 +2355,950 @@
       <w:r>
         <w:rPr>
           <w:rFonts w:eastAsiaTheme="minorEastAsia"/>
-        </w:rPr>
-        <w:t>Note on the structure of this report – the implementation description, the expectations, the measurement/testbench details, the results and the analysis and conclusion are given in that order for each version in its corresponding part.</w:t>
-      </w:r>
+          <w:b/>
+          <w:bCs/>
+        </w:rPr>
+        <w:t>Note</w:t>
+      </w:r>
+      <w:r>
+        <w:rPr>
+          <w:rFonts w:eastAsiaTheme="minorEastAsia"/>
+        </w:rPr>
+        <w:t xml:space="preserve"> on the structure of this report – the implementation description, the expectations, the measurement/testbench details, the results and the analysis and conclusion are given in that order for each version in its corresponding part.</w:t>
+      </w:r>
+    </w:p>
+    <w:p>
+      <w:pPr>
+        <w:pStyle w:val="ListParagraph"/>
+        <w:rPr>
+          <w:rFonts w:eastAsiaTheme="minorEastAsia"/>
+        </w:rPr>
+      </w:pPr>
+    </w:p>
+    <w:p>
+      <w:pPr>
+        <w:pStyle w:val="ListParagraph"/>
+        <w:rPr>
+          <w:rFonts w:eastAsiaTheme="minorEastAsia"/>
+        </w:rPr>
+      </w:pPr>
+      <w:r>
+        <w:rPr>
+          <w:rFonts w:eastAsiaTheme="minorEastAsia"/>
+          <w:b/>
+          <w:bCs/>
+        </w:rPr>
+        <w:t>Note</w:t>
+      </w:r>
+      <w:r>
+        <w:rPr>
+          <w:rFonts w:eastAsiaTheme="minorEastAsia"/>
+        </w:rPr>
+        <w:t xml:space="preserve"> – all the code is executed on a personal laptop with the following characteristics:</w:t>
+      </w:r>
+    </w:p>
+    <w:p>
+      <w:pPr>
+        <w:shd w:val="clear" w:color="auto" w:fill="FDF6E3"/>
+        <w:spacing w:after="0" w:line="285" w:lineRule="atLeast"/>
+        <w:rPr>
+          <w:rFonts w:ascii="Consolas" w:eastAsia="Times New Roman" w:hAnsi="Consolas" w:cs="Times New Roman"/>
+          <w:color w:val="657B83"/>
+          <w:sz w:val="21"/>
+          <w:szCs w:val="21"/>
+        </w:rPr>
+      </w:pPr>
+      <w:r>
+        <w:rPr>
+          <w:rFonts w:ascii="Consolas" w:eastAsia="Times New Roman" w:hAnsi="Consolas" w:cs="Times New Roman"/>
+          <w:color w:val="657B83"/>
+          <w:sz w:val="21"/>
+          <w:szCs w:val="21"/>
+        </w:rPr>
+        <w:t xml:space="preserve">    </w:t>
+      </w:r>
+      <w:r>
+        <w:rPr>
+          <w:rFonts w:ascii="Consolas" w:eastAsia="Times New Roman" w:hAnsi="Consolas" w:cs="Times New Roman"/>
+          <w:color w:val="859900"/>
+          <w:sz w:val="21"/>
+          <w:szCs w:val="21"/>
+        </w:rPr>
+        <w:t>"</w:t>
+      </w:r>
+      <w:proofErr w:type="spellStart"/>
+      <w:proofErr w:type="gramStart"/>
+      <w:r>
+        <w:rPr>
+          <w:rFonts w:ascii="Consolas" w:eastAsia="Times New Roman" w:hAnsi="Consolas" w:cs="Times New Roman"/>
+          <w:color w:val="859900"/>
+          <w:sz w:val="21"/>
+          <w:szCs w:val="21"/>
+        </w:rPr>
+        <w:t>ref</w:t>
+      </w:r>
+      <w:proofErr w:type="gramEnd"/>
+      <w:r>
+        <w:rPr>
+          <w:rFonts w:ascii="Consolas" w:eastAsia="Times New Roman" w:hAnsi="Consolas" w:cs="Times New Roman"/>
+          <w:color w:val="859900"/>
+          <w:sz w:val="21"/>
+          <w:szCs w:val="21"/>
+        </w:rPr>
+        <w:t>_name</w:t>
+      </w:r>
+      <w:proofErr w:type="spellEnd"/>
+      <w:r>
+        <w:rPr>
+          <w:rFonts w:ascii="Consolas" w:eastAsia="Times New Roman" w:hAnsi="Consolas" w:cs="Times New Roman"/>
+          <w:color w:val="859900"/>
+          <w:sz w:val="21"/>
+          <w:szCs w:val="21"/>
+        </w:rPr>
+        <w:t>"</w:t>
+      </w:r>
+      <w:r>
+        <w:rPr>
+          <w:rFonts w:ascii="Consolas" w:eastAsia="Times New Roman" w:hAnsi="Consolas" w:cs="Times New Roman"/>
+          <w:color w:val="657B83"/>
+          <w:sz w:val="21"/>
+          <w:szCs w:val="21"/>
+        </w:rPr>
+        <w:t xml:space="preserve">: </w:t>
+      </w:r>
+      <w:r>
+        <w:rPr>
+          <w:rFonts w:ascii="Consolas" w:eastAsia="Times New Roman" w:hAnsi="Consolas" w:cs="Times New Roman"/>
+          <w:color w:val="2AA198"/>
+          <w:sz w:val="21"/>
+          <w:szCs w:val="21"/>
+        </w:rPr>
+        <w:t>"PC_AMD_Ryzen_7_7735HS"</w:t>
+      </w:r>
+      <w:r>
+        <w:rPr>
+          <w:rFonts w:ascii="Consolas" w:eastAsia="Times New Roman" w:hAnsi="Consolas" w:cs="Times New Roman"/>
+          <w:color w:val="657B83"/>
+          <w:sz w:val="21"/>
+          <w:szCs w:val="21"/>
+        </w:rPr>
+        <w:t>,</w:t>
+      </w:r>
+    </w:p>
+    <w:p>
+      <w:pPr>
+        <w:shd w:val="clear" w:color="auto" w:fill="FDF6E3"/>
+        <w:spacing w:after="0" w:line="285" w:lineRule="atLeast"/>
+        <w:rPr>
+          <w:rFonts w:ascii="Consolas" w:eastAsia="Times New Roman" w:hAnsi="Consolas" w:cs="Times New Roman"/>
+          <w:color w:val="657B83"/>
+          <w:sz w:val="21"/>
+          <w:szCs w:val="21"/>
+        </w:rPr>
+      </w:pPr>
+      <w:r>
+        <w:rPr>
+          <w:rFonts w:ascii="Consolas" w:eastAsia="Times New Roman" w:hAnsi="Consolas" w:cs="Times New Roman"/>
+          <w:color w:val="657B83"/>
+          <w:sz w:val="21"/>
+          <w:szCs w:val="21"/>
+        </w:rPr>
+        <w:t xml:space="preserve">    </w:t>
+      </w:r>
+      <w:r>
+        <w:rPr>
+          <w:rFonts w:ascii="Consolas" w:eastAsia="Times New Roman" w:hAnsi="Consolas" w:cs="Times New Roman"/>
+          <w:color w:val="859900"/>
+          <w:sz w:val="21"/>
+          <w:szCs w:val="21"/>
+        </w:rPr>
+        <w:t>"platform"</w:t>
+      </w:r>
+      <w:r>
+        <w:rPr>
+          <w:rFonts w:ascii="Consolas" w:eastAsia="Times New Roman" w:hAnsi="Consolas" w:cs="Times New Roman"/>
+          <w:color w:val="657B83"/>
+          <w:sz w:val="21"/>
+          <w:szCs w:val="21"/>
+        </w:rPr>
+        <w:t xml:space="preserve">: </w:t>
+      </w:r>
+      <w:r>
+        <w:rPr>
+          <w:rFonts w:ascii="Consolas" w:eastAsia="Times New Roman" w:hAnsi="Consolas" w:cs="Times New Roman"/>
+          <w:color w:val="2AA198"/>
+          <w:sz w:val="21"/>
+          <w:szCs w:val="21"/>
+        </w:rPr>
+        <w:t>"Windows-11-10.0.26200-SP0"</w:t>
+      </w:r>
+      <w:r>
+        <w:rPr>
+          <w:rFonts w:ascii="Consolas" w:eastAsia="Times New Roman" w:hAnsi="Consolas" w:cs="Times New Roman"/>
+          <w:color w:val="657B83"/>
+          <w:sz w:val="21"/>
+          <w:szCs w:val="21"/>
+        </w:rPr>
+        <w:t>,</w:t>
+      </w:r>
+    </w:p>
+    <w:p>
+      <w:pPr>
+        <w:shd w:val="clear" w:color="auto" w:fill="FDF6E3"/>
+        <w:spacing w:after="0" w:line="285" w:lineRule="atLeast"/>
+        <w:rPr>
+          <w:rFonts w:ascii="Consolas" w:eastAsia="Times New Roman" w:hAnsi="Consolas" w:cs="Times New Roman"/>
+          <w:color w:val="657B83"/>
+          <w:sz w:val="21"/>
+          <w:szCs w:val="21"/>
+        </w:rPr>
+      </w:pPr>
+      <w:r>
+        <w:rPr>
+          <w:rFonts w:ascii="Consolas" w:eastAsia="Times New Roman" w:hAnsi="Consolas" w:cs="Times New Roman"/>
+          <w:color w:val="657B83"/>
+          <w:sz w:val="21"/>
+          <w:szCs w:val="21"/>
+        </w:rPr>
+        <w:t xml:space="preserve">    </w:t>
+      </w:r>
+      <w:r>
+        <w:rPr>
+          <w:rFonts w:ascii="Consolas" w:eastAsia="Times New Roman" w:hAnsi="Consolas" w:cs="Times New Roman"/>
+          <w:color w:val="859900"/>
+          <w:sz w:val="21"/>
+          <w:szCs w:val="21"/>
+        </w:rPr>
+        <w:t>"processor"</w:t>
+      </w:r>
+      <w:r>
+        <w:rPr>
+          <w:rFonts w:ascii="Consolas" w:eastAsia="Times New Roman" w:hAnsi="Consolas" w:cs="Times New Roman"/>
+          <w:color w:val="657B83"/>
+          <w:sz w:val="21"/>
+          <w:szCs w:val="21"/>
+        </w:rPr>
+        <w:t xml:space="preserve">: </w:t>
+      </w:r>
+      <w:r>
+        <w:rPr>
+          <w:rFonts w:ascii="Consolas" w:eastAsia="Times New Roman" w:hAnsi="Consolas" w:cs="Times New Roman"/>
+          <w:color w:val="2AA198"/>
+          <w:sz w:val="21"/>
+          <w:szCs w:val="21"/>
+        </w:rPr>
+        <w:t xml:space="preserve">"AMD64 Family 25 Model 68 Stepping 1, </w:t>
+      </w:r>
+      <w:proofErr w:type="spellStart"/>
+      <w:r>
+        <w:rPr>
+          <w:rFonts w:ascii="Consolas" w:eastAsia="Times New Roman" w:hAnsi="Consolas" w:cs="Times New Roman"/>
+          <w:color w:val="2AA198"/>
+          <w:sz w:val="21"/>
+          <w:szCs w:val="21"/>
+        </w:rPr>
+        <w:t>AuthenticAMD</w:t>
+      </w:r>
+      <w:proofErr w:type="spellEnd"/>
+      <w:r>
+        <w:rPr>
+          <w:rFonts w:ascii="Consolas" w:eastAsia="Times New Roman" w:hAnsi="Consolas" w:cs="Times New Roman"/>
+          <w:color w:val="2AA198"/>
+          <w:sz w:val="21"/>
+          <w:szCs w:val="21"/>
+        </w:rPr>
+        <w:t>"</w:t>
+      </w:r>
+      <w:r>
+        <w:rPr>
+          <w:rFonts w:ascii="Consolas" w:eastAsia="Times New Roman" w:hAnsi="Consolas" w:cs="Times New Roman"/>
+          <w:color w:val="657B83"/>
+          <w:sz w:val="21"/>
+          <w:szCs w:val="21"/>
+        </w:rPr>
+        <w:t>,</w:t>
+      </w:r>
+    </w:p>
+    <w:p>
+      <w:pPr>
+        <w:shd w:val="clear" w:color="auto" w:fill="FDF6E3"/>
+        <w:spacing w:after="0" w:line="285" w:lineRule="atLeast"/>
+        <w:rPr>
+          <w:rFonts w:ascii="Consolas" w:eastAsia="Times New Roman" w:hAnsi="Consolas" w:cs="Times New Roman"/>
+          <w:color w:val="657B83"/>
+          <w:sz w:val="21"/>
+          <w:szCs w:val="21"/>
+        </w:rPr>
+      </w:pPr>
+      <w:r>
+        <w:rPr>
+          <w:rFonts w:ascii="Consolas" w:eastAsia="Times New Roman" w:hAnsi="Consolas" w:cs="Times New Roman"/>
+          <w:color w:val="657B83"/>
+          <w:sz w:val="21"/>
+          <w:szCs w:val="21"/>
+        </w:rPr>
+        <w:t xml:space="preserve">    </w:t>
+      </w:r>
+      <w:r>
+        <w:rPr>
+          <w:rFonts w:ascii="Consolas" w:eastAsia="Times New Roman" w:hAnsi="Consolas" w:cs="Times New Roman"/>
+          <w:color w:val="859900"/>
+          <w:sz w:val="21"/>
+          <w:szCs w:val="21"/>
+        </w:rPr>
+        <w:t>"</w:t>
+      </w:r>
+      <w:proofErr w:type="spellStart"/>
+      <w:proofErr w:type="gramStart"/>
+      <w:r>
+        <w:rPr>
+          <w:rFonts w:ascii="Consolas" w:eastAsia="Times New Roman" w:hAnsi="Consolas" w:cs="Times New Roman"/>
+          <w:color w:val="859900"/>
+          <w:sz w:val="21"/>
+          <w:szCs w:val="21"/>
+        </w:rPr>
+        <w:t>cpu</w:t>
+      </w:r>
+      <w:proofErr w:type="gramEnd"/>
+      <w:r>
+        <w:rPr>
+          <w:rFonts w:ascii="Consolas" w:eastAsia="Times New Roman" w:hAnsi="Consolas" w:cs="Times New Roman"/>
+          <w:color w:val="859900"/>
+          <w:sz w:val="21"/>
+          <w:szCs w:val="21"/>
+        </w:rPr>
+        <w:t>_count_logical</w:t>
+      </w:r>
+      <w:proofErr w:type="spellEnd"/>
+      <w:r>
+        <w:rPr>
+          <w:rFonts w:ascii="Consolas" w:eastAsia="Times New Roman" w:hAnsi="Consolas" w:cs="Times New Roman"/>
+          <w:color w:val="859900"/>
+          <w:sz w:val="21"/>
+          <w:szCs w:val="21"/>
+        </w:rPr>
+        <w:t>"</w:t>
+      </w:r>
+      <w:r>
+        <w:rPr>
+          <w:rFonts w:ascii="Consolas" w:eastAsia="Times New Roman" w:hAnsi="Consolas" w:cs="Times New Roman"/>
+          <w:color w:val="657B83"/>
+          <w:sz w:val="21"/>
+          <w:szCs w:val="21"/>
+        </w:rPr>
+        <w:t xml:space="preserve">: </w:t>
+      </w:r>
+      <w:r>
+        <w:rPr>
+          <w:rFonts w:ascii="Consolas" w:eastAsia="Times New Roman" w:hAnsi="Consolas" w:cs="Times New Roman"/>
+          <w:color w:val="D33682"/>
+          <w:sz w:val="21"/>
+          <w:szCs w:val="21"/>
+        </w:rPr>
+        <w:t>16</w:t>
+      </w:r>
+      <w:r>
+        <w:rPr>
+          <w:rFonts w:ascii="Consolas" w:eastAsia="Times New Roman" w:hAnsi="Consolas" w:cs="Times New Roman"/>
+          <w:color w:val="657B83"/>
+          <w:sz w:val="21"/>
+          <w:szCs w:val="21"/>
+        </w:rPr>
+        <w:t>,</w:t>
+      </w:r>
+    </w:p>
+    <w:p>
+      <w:pPr>
+        <w:shd w:val="clear" w:color="auto" w:fill="FDF6E3"/>
+        <w:spacing w:after="0" w:line="285" w:lineRule="atLeast"/>
+        <w:rPr>
+          <w:rFonts w:ascii="Consolas" w:eastAsia="Times New Roman" w:hAnsi="Consolas" w:cs="Times New Roman"/>
+          <w:color w:val="657B83"/>
+          <w:sz w:val="21"/>
+          <w:szCs w:val="21"/>
+        </w:rPr>
+      </w:pPr>
+      <w:r>
+        <w:rPr>
+          <w:rFonts w:ascii="Consolas" w:eastAsia="Times New Roman" w:hAnsi="Consolas" w:cs="Times New Roman"/>
+          <w:color w:val="657B83"/>
+          <w:sz w:val="21"/>
+          <w:szCs w:val="21"/>
+        </w:rPr>
+        <w:t xml:space="preserve">    </w:t>
+      </w:r>
+      <w:r>
+        <w:rPr>
+          <w:rFonts w:ascii="Consolas" w:eastAsia="Times New Roman" w:hAnsi="Consolas" w:cs="Times New Roman"/>
+          <w:color w:val="859900"/>
+          <w:sz w:val="21"/>
+          <w:szCs w:val="21"/>
+        </w:rPr>
+        <w:t>"</w:t>
+      </w:r>
+      <w:proofErr w:type="spellStart"/>
+      <w:proofErr w:type="gramStart"/>
+      <w:r>
+        <w:rPr>
+          <w:rFonts w:ascii="Consolas" w:eastAsia="Times New Roman" w:hAnsi="Consolas" w:cs="Times New Roman"/>
+          <w:color w:val="859900"/>
+          <w:sz w:val="21"/>
+          <w:szCs w:val="21"/>
+        </w:rPr>
+        <w:t>cpu</w:t>
+      </w:r>
+      <w:proofErr w:type="gramEnd"/>
+      <w:r>
+        <w:rPr>
+          <w:rFonts w:ascii="Consolas" w:eastAsia="Times New Roman" w:hAnsi="Consolas" w:cs="Times New Roman"/>
+          <w:color w:val="859900"/>
+          <w:sz w:val="21"/>
+          <w:szCs w:val="21"/>
+        </w:rPr>
+        <w:t>_count_physical</w:t>
+      </w:r>
+      <w:proofErr w:type="spellEnd"/>
+      <w:r>
+        <w:rPr>
+          <w:rFonts w:ascii="Consolas" w:eastAsia="Times New Roman" w:hAnsi="Consolas" w:cs="Times New Roman"/>
+          <w:color w:val="859900"/>
+          <w:sz w:val="21"/>
+          <w:szCs w:val="21"/>
+        </w:rPr>
+        <w:t>"</w:t>
+      </w:r>
+      <w:r>
+        <w:rPr>
+          <w:rFonts w:ascii="Consolas" w:eastAsia="Times New Roman" w:hAnsi="Consolas" w:cs="Times New Roman"/>
+          <w:color w:val="657B83"/>
+          <w:sz w:val="21"/>
+          <w:szCs w:val="21"/>
+        </w:rPr>
+        <w:t xml:space="preserve">: </w:t>
+      </w:r>
+      <w:r>
+        <w:rPr>
+          <w:rFonts w:ascii="Consolas" w:eastAsia="Times New Roman" w:hAnsi="Consolas" w:cs="Times New Roman"/>
+          <w:color w:val="D33682"/>
+          <w:sz w:val="21"/>
+          <w:szCs w:val="21"/>
+        </w:rPr>
+        <w:t>8</w:t>
+      </w:r>
+      <w:r>
+        <w:rPr>
+          <w:rFonts w:ascii="Consolas" w:eastAsia="Times New Roman" w:hAnsi="Consolas" w:cs="Times New Roman"/>
+          <w:color w:val="657B83"/>
+          <w:sz w:val="21"/>
+          <w:szCs w:val="21"/>
+        </w:rPr>
+        <w:t>,</w:t>
+      </w:r>
+    </w:p>
+    <w:p>
+      <w:pPr>
+        <w:shd w:val="clear" w:color="auto" w:fill="FDF6E3"/>
+        <w:spacing w:after="0" w:line="285" w:lineRule="atLeast"/>
+        <w:rPr>
+          <w:rFonts w:ascii="Consolas" w:eastAsia="Times New Roman" w:hAnsi="Consolas" w:cs="Times New Roman"/>
+          <w:color w:val="657B83"/>
+          <w:sz w:val="21"/>
+          <w:szCs w:val="21"/>
+        </w:rPr>
+      </w:pPr>
+      <w:r>
+        <w:rPr>
+          <w:rFonts w:ascii="Consolas" w:eastAsia="Times New Roman" w:hAnsi="Consolas" w:cs="Times New Roman"/>
+          <w:color w:val="657B83"/>
+          <w:sz w:val="21"/>
+          <w:szCs w:val="21"/>
+        </w:rPr>
+        <w:t xml:space="preserve">    </w:t>
+      </w:r>
+      <w:r>
+        <w:rPr>
+          <w:rFonts w:ascii="Consolas" w:eastAsia="Times New Roman" w:hAnsi="Consolas" w:cs="Times New Roman"/>
+          <w:color w:val="859900"/>
+          <w:sz w:val="21"/>
+          <w:szCs w:val="21"/>
+        </w:rPr>
+        <w:t>"</w:t>
+      </w:r>
+      <w:proofErr w:type="spellStart"/>
+      <w:proofErr w:type="gramStart"/>
+      <w:r>
+        <w:rPr>
+          <w:rFonts w:ascii="Consolas" w:eastAsia="Times New Roman" w:hAnsi="Consolas" w:cs="Times New Roman"/>
+          <w:color w:val="859900"/>
+          <w:sz w:val="21"/>
+          <w:szCs w:val="21"/>
+        </w:rPr>
+        <w:t>ram</w:t>
+      </w:r>
+      <w:proofErr w:type="gramEnd"/>
+      <w:r>
+        <w:rPr>
+          <w:rFonts w:ascii="Consolas" w:eastAsia="Times New Roman" w:hAnsi="Consolas" w:cs="Times New Roman"/>
+          <w:color w:val="859900"/>
+          <w:sz w:val="21"/>
+          <w:szCs w:val="21"/>
+        </w:rPr>
+        <w:t>_gb</w:t>
+      </w:r>
+      <w:proofErr w:type="spellEnd"/>
+      <w:r>
+        <w:rPr>
+          <w:rFonts w:ascii="Consolas" w:eastAsia="Times New Roman" w:hAnsi="Consolas" w:cs="Times New Roman"/>
+          <w:color w:val="859900"/>
+          <w:sz w:val="21"/>
+          <w:szCs w:val="21"/>
+        </w:rPr>
+        <w:t>"</w:t>
+      </w:r>
+      <w:r>
+        <w:rPr>
+          <w:rFonts w:ascii="Consolas" w:eastAsia="Times New Roman" w:hAnsi="Consolas" w:cs="Times New Roman"/>
+          <w:color w:val="657B83"/>
+          <w:sz w:val="21"/>
+          <w:szCs w:val="21"/>
+        </w:rPr>
+        <w:t xml:space="preserve">: </w:t>
+      </w:r>
+      <w:r>
+        <w:rPr>
+          <w:rFonts w:ascii="Consolas" w:eastAsia="Times New Roman" w:hAnsi="Consolas" w:cs="Times New Roman"/>
+          <w:color w:val="D33682"/>
+          <w:sz w:val="21"/>
+          <w:szCs w:val="21"/>
+        </w:rPr>
+        <w:t>29.36</w:t>
+      </w:r>
+      <w:r>
+        <w:rPr>
+          <w:rFonts w:ascii="Consolas" w:eastAsia="Times New Roman" w:hAnsi="Consolas" w:cs="Times New Roman"/>
+          <w:color w:val="657B83"/>
+          <w:sz w:val="21"/>
+          <w:szCs w:val="21"/>
+        </w:rPr>
+        <w:t>,</w:t>
+      </w:r>
+    </w:p>
+    <w:p>
+      <w:pPr>
+        <w:shd w:val="clear" w:color="auto" w:fill="FDF6E3"/>
+        <w:spacing w:after="0" w:line="285" w:lineRule="atLeast"/>
+        <w:rPr>
+          <w:rFonts w:ascii="Consolas" w:eastAsia="Times New Roman" w:hAnsi="Consolas" w:cs="Times New Roman"/>
+          <w:color w:val="657B83"/>
+          <w:sz w:val="21"/>
+          <w:szCs w:val="21"/>
+        </w:rPr>
+      </w:pPr>
+      <w:r>
+        <w:rPr>
+          <w:rFonts w:ascii="Consolas" w:eastAsia="Times New Roman" w:hAnsi="Consolas" w:cs="Times New Roman"/>
+          <w:color w:val="657B83"/>
+          <w:sz w:val="21"/>
+          <w:szCs w:val="21"/>
+        </w:rPr>
+        <w:t xml:space="preserve">    </w:t>
+      </w:r>
+      <w:r>
+        <w:rPr>
+          <w:rFonts w:ascii="Consolas" w:eastAsia="Times New Roman" w:hAnsi="Consolas" w:cs="Times New Roman"/>
+          <w:color w:val="859900"/>
+          <w:sz w:val="21"/>
+          <w:szCs w:val="21"/>
+        </w:rPr>
+        <w:t>"L1_Data_cache_per_core"</w:t>
+      </w:r>
+      <w:r>
+        <w:rPr>
+          <w:rFonts w:ascii="Consolas" w:eastAsia="Times New Roman" w:hAnsi="Consolas" w:cs="Times New Roman"/>
+          <w:color w:val="657B83"/>
+          <w:sz w:val="21"/>
+          <w:szCs w:val="21"/>
+        </w:rPr>
+        <w:t xml:space="preserve">: </w:t>
+      </w:r>
+      <w:r>
+        <w:rPr>
+          <w:rFonts w:ascii="Consolas" w:eastAsia="Times New Roman" w:hAnsi="Consolas" w:cs="Times New Roman"/>
+          <w:color w:val="2AA198"/>
+          <w:sz w:val="21"/>
+          <w:szCs w:val="21"/>
+        </w:rPr>
+        <w:t>"32 KiB"</w:t>
+      </w:r>
+      <w:r>
+        <w:rPr>
+          <w:rFonts w:ascii="Consolas" w:eastAsia="Times New Roman" w:hAnsi="Consolas" w:cs="Times New Roman"/>
+          <w:color w:val="657B83"/>
+          <w:sz w:val="21"/>
+          <w:szCs w:val="21"/>
+        </w:rPr>
+        <w:t>,</w:t>
+      </w:r>
+    </w:p>
+    <w:p>
+      <w:pPr>
+        <w:shd w:val="clear" w:color="auto" w:fill="FDF6E3"/>
+        <w:spacing w:after="0" w:line="285" w:lineRule="atLeast"/>
+        <w:rPr>
+          <w:rFonts w:ascii="Consolas" w:eastAsia="Times New Roman" w:hAnsi="Consolas" w:cs="Times New Roman"/>
+          <w:color w:val="657B83"/>
+          <w:sz w:val="21"/>
+          <w:szCs w:val="21"/>
+        </w:rPr>
+      </w:pPr>
+      <w:r>
+        <w:rPr>
+          <w:rFonts w:ascii="Consolas" w:eastAsia="Times New Roman" w:hAnsi="Consolas" w:cs="Times New Roman"/>
+          <w:color w:val="657B83"/>
+          <w:sz w:val="21"/>
+          <w:szCs w:val="21"/>
+        </w:rPr>
+        <w:t xml:space="preserve">    </w:t>
+      </w:r>
+      <w:r>
+        <w:rPr>
+          <w:rFonts w:ascii="Consolas" w:eastAsia="Times New Roman" w:hAnsi="Consolas" w:cs="Times New Roman"/>
+          <w:color w:val="859900"/>
+          <w:sz w:val="21"/>
+          <w:szCs w:val="21"/>
+        </w:rPr>
+        <w:t>"L1_Instruction_cache_per_core"</w:t>
+      </w:r>
+      <w:r>
+        <w:rPr>
+          <w:rFonts w:ascii="Consolas" w:eastAsia="Times New Roman" w:hAnsi="Consolas" w:cs="Times New Roman"/>
+          <w:color w:val="657B83"/>
+          <w:sz w:val="21"/>
+          <w:szCs w:val="21"/>
+        </w:rPr>
+        <w:t xml:space="preserve">: </w:t>
+      </w:r>
+      <w:r>
+        <w:rPr>
+          <w:rFonts w:ascii="Consolas" w:eastAsia="Times New Roman" w:hAnsi="Consolas" w:cs="Times New Roman"/>
+          <w:color w:val="2AA198"/>
+          <w:sz w:val="21"/>
+          <w:szCs w:val="21"/>
+        </w:rPr>
+        <w:t>"32 KiB"</w:t>
+      </w:r>
+      <w:r>
+        <w:rPr>
+          <w:rFonts w:ascii="Consolas" w:eastAsia="Times New Roman" w:hAnsi="Consolas" w:cs="Times New Roman"/>
+          <w:color w:val="657B83"/>
+          <w:sz w:val="21"/>
+          <w:szCs w:val="21"/>
+        </w:rPr>
+        <w:t>,</w:t>
+      </w:r>
+    </w:p>
+    <w:p>
+      <w:pPr>
+        <w:shd w:val="clear" w:color="auto" w:fill="FDF6E3"/>
+        <w:spacing w:after="0" w:line="285" w:lineRule="atLeast"/>
+        <w:rPr>
+          <w:rFonts w:ascii="Consolas" w:eastAsia="Times New Roman" w:hAnsi="Consolas" w:cs="Times New Roman"/>
+          <w:color w:val="657B83"/>
+          <w:sz w:val="21"/>
+          <w:szCs w:val="21"/>
+        </w:rPr>
+      </w:pPr>
+      <w:r>
+        <w:rPr>
+          <w:rFonts w:ascii="Consolas" w:eastAsia="Times New Roman" w:hAnsi="Consolas" w:cs="Times New Roman"/>
+          <w:color w:val="657B83"/>
+          <w:sz w:val="21"/>
+          <w:szCs w:val="21"/>
+        </w:rPr>
+        <w:t xml:space="preserve">    </w:t>
+      </w:r>
+      <w:r>
+        <w:rPr>
+          <w:rFonts w:ascii="Consolas" w:eastAsia="Times New Roman" w:hAnsi="Consolas" w:cs="Times New Roman"/>
+          <w:color w:val="859900"/>
+          <w:sz w:val="21"/>
+          <w:szCs w:val="21"/>
+        </w:rPr>
+        <w:t>"L2_cache_per_core"</w:t>
+      </w:r>
+      <w:r>
+        <w:rPr>
+          <w:rFonts w:ascii="Consolas" w:eastAsia="Times New Roman" w:hAnsi="Consolas" w:cs="Times New Roman"/>
+          <w:color w:val="657B83"/>
+          <w:sz w:val="21"/>
+          <w:szCs w:val="21"/>
+        </w:rPr>
+        <w:t xml:space="preserve">: </w:t>
+      </w:r>
+      <w:r>
+        <w:rPr>
+          <w:rFonts w:ascii="Consolas" w:eastAsia="Times New Roman" w:hAnsi="Consolas" w:cs="Times New Roman"/>
+          <w:color w:val="2AA198"/>
+          <w:sz w:val="21"/>
+          <w:szCs w:val="21"/>
+        </w:rPr>
+        <w:t>"512KiB"</w:t>
+      </w:r>
+      <w:r>
+        <w:rPr>
+          <w:rFonts w:ascii="Consolas" w:eastAsia="Times New Roman" w:hAnsi="Consolas" w:cs="Times New Roman"/>
+          <w:color w:val="657B83"/>
+          <w:sz w:val="21"/>
+          <w:szCs w:val="21"/>
+        </w:rPr>
+        <w:t>,</w:t>
+      </w:r>
+    </w:p>
+    <w:p>
+      <w:pPr>
+        <w:shd w:val="clear" w:color="auto" w:fill="FDF6E3"/>
+        <w:spacing w:after="0" w:line="285" w:lineRule="atLeast"/>
+        <w:rPr>
+          <w:rFonts w:ascii="Consolas" w:eastAsia="Times New Roman" w:hAnsi="Consolas" w:cs="Times New Roman"/>
+          <w:color w:val="657B83"/>
+          <w:sz w:val="21"/>
+          <w:szCs w:val="21"/>
+        </w:rPr>
+      </w:pPr>
+      <w:r>
+        <w:rPr>
+          <w:rFonts w:ascii="Consolas" w:eastAsia="Times New Roman" w:hAnsi="Consolas" w:cs="Times New Roman"/>
+          <w:color w:val="657B83"/>
+          <w:sz w:val="21"/>
+          <w:szCs w:val="21"/>
+        </w:rPr>
+        <w:t xml:space="preserve">    </w:t>
+      </w:r>
+      <w:r>
+        <w:rPr>
+          <w:rFonts w:ascii="Consolas" w:eastAsia="Times New Roman" w:hAnsi="Consolas" w:cs="Times New Roman"/>
+          <w:color w:val="859900"/>
+          <w:sz w:val="21"/>
+          <w:szCs w:val="21"/>
+        </w:rPr>
+        <w:t>"L3_cache_shared_across_all_cores"</w:t>
+      </w:r>
+      <w:r>
+        <w:rPr>
+          <w:rFonts w:ascii="Consolas" w:eastAsia="Times New Roman" w:hAnsi="Consolas" w:cs="Times New Roman"/>
+          <w:color w:val="657B83"/>
+          <w:sz w:val="21"/>
+          <w:szCs w:val="21"/>
+        </w:rPr>
+        <w:t xml:space="preserve">: </w:t>
+      </w:r>
+      <w:r>
+        <w:rPr>
+          <w:rFonts w:ascii="Consolas" w:eastAsia="Times New Roman" w:hAnsi="Consolas" w:cs="Times New Roman"/>
+          <w:color w:val="2AA198"/>
+          <w:sz w:val="21"/>
+          <w:szCs w:val="21"/>
+        </w:rPr>
+        <w:t>"16MiB"</w:t>
+      </w:r>
+    </w:p>
+    <w:p>
+      <w:pPr>
+        <w:pStyle w:val="ListParagraph"/>
+        <w:rPr>
+          <w:rFonts w:eastAsiaTheme="minorEastAsia"/>
+        </w:rPr>
+      </w:pPr>
+      <w:r>
+        <w:rPr>
+          <w:rFonts w:eastAsiaTheme="minorEastAsia"/>
+        </w:rPr>
+        <w:t>The SW versions are:</w:t>
+      </w:r>
+    </w:p>
+    <w:p>
+      <w:pPr>
+        <w:shd w:val="clear" w:color="auto" w:fill="FDF6E3"/>
+        <w:spacing w:after="0" w:line="285" w:lineRule="atLeast"/>
+        <w:rPr>
+          <w:rFonts w:ascii="Consolas" w:eastAsia="Times New Roman" w:hAnsi="Consolas" w:cs="Times New Roman"/>
+          <w:color w:val="657B83"/>
+          <w:sz w:val="21"/>
+          <w:szCs w:val="21"/>
+        </w:rPr>
+      </w:pPr>
+      <w:r>
+        <w:rPr>
+          <w:rFonts w:ascii="Consolas" w:eastAsia="Times New Roman" w:hAnsi="Consolas" w:cs="Times New Roman"/>
+          <w:color w:val="657B83"/>
+          <w:sz w:val="21"/>
+          <w:szCs w:val="21"/>
+        </w:rPr>
+        <w:t xml:space="preserve">    </w:t>
+      </w:r>
+      <w:r>
+        <w:rPr>
+          <w:rFonts w:ascii="Consolas" w:eastAsia="Times New Roman" w:hAnsi="Consolas" w:cs="Times New Roman"/>
+          <w:color w:val="859900"/>
+          <w:sz w:val="21"/>
+          <w:szCs w:val="21"/>
+        </w:rPr>
+        <w:t>"</w:t>
+      </w:r>
+      <w:proofErr w:type="spellStart"/>
+      <w:proofErr w:type="gramStart"/>
+      <w:r>
+        <w:rPr>
+          <w:rFonts w:ascii="Consolas" w:eastAsia="Times New Roman" w:hAnsi="Consolas" w:cs="Times New Roman"/>
+          <w:color w:val="859900"/>
+          <w:sz w:val="21"/>
+          <w:szCs w:val="21"/>
+        </w:rPr>
+        <w:t>python</w:t>
+      </w:r>
+      <w:proofErr w:type="gramEnd"/>
+      <w:r>
+        <w:rPr>
+          <w:rFonts w:ascii="Consolas" w:eastAsia="Times New Roman" w:hAnsi="Consolas" w:cs="Times New Roman"/>
+          <w:color w:val="859900"/>
+          <w:sz w:val="21"/>
+          <w:szCs w:val="21"/>
+        </w:rPr>
+        <w:t>_version</w:t>
+      </w:r>
+      <w:proofErr w:type="spellEnd"/>
+      <w:r>
+        <w:rPr>
+          <w:rFonts w:ascii="Consolas" w:eastAsia="Times New Roman" w:hAnsi="Consolas" w:cs="Times New Roman"/>
+          <w:color w:val="859900"/>
+          <w:sz w:val="21"/>
+          <w:szCs w:val="21"/>
+        </w:rPr>
+        <w:t>"</w:t>
+      </w:r>
+      <w:r>
+        <w:rPr>
+          <w:rFonts w:ascii="Consolas" w:eastAsia="Times New Roman" w:hAnsi="Consolas" w:cs="Times New Roman"/>
+          <w:color w:val="657B83"/>
+          <w:sz w:val="21"/>
+          <w:szCs w:val="21"/>
+        </w:rPr>
+        <w:t xml:space="preserve">: </w:t>
+      </w:r>
+      <w:r>
+        <w:rPr>
+          <w:rFonts w:ascii="Consolas" w:eastAsia="Times New Roman" w:hAnsi="Consolas" w:cs="Times New Roman"/>
+          <w:color w:val="2AA198"/>
+          <w:sz w:val="21"/>
+          <w:szCs w:val="21"/>
+        </w:rPr>
+        <w:t>"3.13.14"</w:t>
+      </w:r>
+      <w:r>
+        <w:rPr>
+          <w:rFonts w:ascii="Consolas" w:eastAsia="Times New Roman" w:hAnsi="Consolas" w:cs="Times New Roman"/>
+          <w:color w:val="657B83"/>
+          <w:sz w:val="21"/>
+          <w:szCs w:val="21"/>
+        </w:rPr>
+        <w:t>,</w:t>
+      </w:r>
+    </w:p>
+    <w:p>
+      <w:pPr>
+        <w:shd w:val="clear" w:color="auto" w:fill="FDF6E3"/>
+        <w:spacing w:after="0" w:line="285" w:lineRule="atLeast"/>
+        <w:rPr>
+          <w:rFonts w:ascii="Consolas" w:eastAsia="Times New Roman" w:hAnsi="Consolas" w:cs="Times New Roman"/>
+          <w:color w:val="657B83"/>
+          <w:sz w:val="21"/>
+          <w:szCs w:val="21"/>
+        </w:rPr>
+      </w:pPr>
+      <w:r>
+        <w:rPr>
+          <w:rFonts w:ascii="Consolas" w:eastAsia="Times New Roman" w:hAnsi="Consolas" w:cs="Times New Roman"/>
+          <w:color w:val="657B83"/>
+          <w:sz w:val="21"/>
+          <w:szCs w:val="21"/>
+        </w:rPr>
+        <w:t xml:space="preserve">    </w:t>
+      </w:r>
+      <w:r>
+        <w:rPr>
+          <w:rFonts w:ascii="Consolas" w:eastAsia="Times New Roman" w:hAnsi="Consolas" w:cs="Times New Roman"/>
+          <w:color w:val="859900"/>
+          <w:sz w:val="21"/>
+          <w:szCs w:val="21"/>
+        </w:rPr>
+        <w:t>"</w:t>
+      </w:r>
+      <w:proofErr w:type="spellStart"/>
+      <w:proofErr w:type="gramStart"/>
+      <w:r>
+        <w:rPr>
+          <w:rFonts w:ascii="Consolas" w:eastAsia="Times New Roman" w:hAnsi="Consolas" w:cs="Times New Roman"/>
+          <w:color w:val="859900"/>
+          <w:sz w:val="21"/>
+          <w:szCs w:val="21"/>
+        </w:rPr>
+        <w:t>numpy</w:t>
+      </w:r>
+      <w:proofErr w:type="gramEnd"/>
+      <w:r>
+        <w:rPr>
+          <w:rFonts w:ascii="Consolas" w:eastAsia="Times New Roman" w:hAnsi="Consolas" w:cs="Times New Roman"/>
+          <w:color w:val="859900"/>
+          <w:sz w:val="21"/>
+          <w:szCs w:val="21"/>
+        </w:rPr>
+        <w:t>_version</w:t>
+      </w:r>
+      <w:proofErr w:type="spellEnd"/>
+      <w:r>
+        <w:rPr>
+          <w:rFonts w:ascii="Consolas" w:eastAsia="Times New Roman" w:hAnsi="Consolas" w:cs="Times New Roman"/>
+          <w:color w:val="859900"/>
+          <w:sz w:val="21"/>
+          <w:szCs w:val="21"/>
+        </w:rPr>
+        <w:t>"</w:t>
+      </w:r>
+      <w:r>
+        <w:rPr>
+          <w:rFonts w:ascii="Consolas" w:eastAsia="Times New Roman" w:hAnsi="Consolas" w:cs="Times New Roman"/>
+          <w:color w:val="657B83"/>
+          <w:sz w:val="21"/>
+          <w:szCs w:val="21"/>
+        </w:rPr>
+        <w:t xml:space="preserve">: </w:t>
+      </w:r>
+      <w:r>
+        <w:rPr>
+          <w:rFonts w:ascii="Consolas" w:eastAsia="Times New Roman" w:hAnsi="Consolas" w:cs="Times New Roman"/>
+          <w:color w:val="2AA198"/>
+          <w:sz w:val="21"/>
+          <w:szCs w:val="21"/>
+        </w:rPr>
+        <w:t>"2.2.6"</w:t>
+      </w:r>
+      <w:r>
+        <w:rPr>
+          <w:rFonts w:ascii="Consolas" w:eastAsia="Times New Roman" w:hAnsi="Consolas" w:cs="Times New Roman"/>
+          <w:color w:val="657B83"/>
+          <w:sz w:val="21"/>
+          <w:szCs w:val="21"/>
+        </w:rPr>
+        <w:t>,</w:t>
+      </w:r>
+    </w:p>
+    <w:p>
+      <w:pPr>
+        <w:pStyle w:val="ListParagraph"/>
+        <w:rPr>
+          <w:rFonts w:eastAsiaTheme="minorEastAsia"/>
+        </w:rPr>
+      </w:pPr>
     </w:p>
     <w:p>
       <w:pPr>
@@ -8027,7 +8968,7 @@
           </mc:Choice>
           <mc:Fallback>
             <w:pict>
-              <v:shapetype w14:anchorId="71C3C6C2" id="_x0000_t32" coordsize="21600,21600" o:spt="32" o:oned="t" path="m,l21600,21600e" filled="f">
+              <v:shapetype w14:anchorId="4E52739F" id="_x0000_t32" coordsize="21600,21600" o:spt="32" o:oned="t" path="m,l21600,21600e" filled="f">
                 <v:path arrowok="t" fillok="f" o:connecttype="none"/>
                 <o:lock v:ext="edit" shapetype="t"/>
               </v:shapetype>
@@ -10945,7 +11886,7 @@
           </mc:Choice>
           <mc:Fallback>
             <w:pict>
-              <v:shape w14:anchorId="05030CD5" id="Straight Arrow Connector 16" o:spid="_x0000_s1026" type="#_x0000_t32" style="position:absolute;margin-left:210.65pt;margin-top:64.65pt;width:18pt;height:0;z-index:251666432;visibility:visible;mso-wrap-style:square;mso-width-percent:0;mso-height-percent:0;mso-wrap-distance-left:9pt;mso-wrap-distance-top:0;mso-wrap-distance-right:9pt;mso-wrap-distance-bottom:0;mso-position-horizontal:absolute;mso-position-horizontal-relative:margin;mso-position-vertical:absolute;mso-position-vertical-relative:text;mso-width-percent:0;mso-height-percent:0;mso-width-relative:margin;mso-height-relative:margin" o:gfxdata="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" strokecolor="#4472c4 [3204]" strokeweight=".5pt">
+              <v:shape w14:anchorId="61DF66AA" id="Straight Arrow Connector 16" o:spid="_x0000_s1026" type="#_x0000_t32" style="position:absolute;margin-left:210.65pt;margin-top:64.65pt;width:18pt;height:0;z-index:251666432;visibility:visible;mso-wrap-style:square;mso-width-percent:0;mso-height-percent:0;mso-wrap-distance-left:9pt;mso-wrap-distance-top:0;mso-wrap-distance-right:9pt;mso-wrap-distance-bottom:0;mso-position-horizontal:absolute;mso-position-horizontal-relative:margin;mso-position-vertical:absolute;mso-position-vertical-relative:text;mso-width-percent:0;mso-height-percent:0;mso-width-relative:margin;mso-height-relative:margin" o:gfxdata="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" strokecolor="#4472c4 [3204]" strokeweight=".5pt">
                 <v:stroke endarrow="block" joinstyle="miter"/>
                 <w10:wrap anchorx="margin"/>
               </v:shape>
@@ -13376,34 +14317,158 @@
     </w:p>
     <w:p>
       <w:pPr>
-        <w:rPr>
-          <w:rFonts w:eastAsiaTheme="minorEastAsia"/>
-        </w:rPr>
-      </w:pPr>
+        <w:ind w:firstLine="720"/>
+        <w:rPr>
+          <w:rFonts w:eastAsiaTheme="minorEastAsia"/>
+        </w:rPr>
+      </w:pPr>
+      <w:r>
+        <w:rPr>
+          <w:rFonts w:eastAsiaTheme="minorEastAsia"/>
+        </w:rPr>
+        <w:t xml:space="preserve">The interesting testbench here is to compare the speed-up </w:t>
+      </w:r>
+      <w:r>
+        <w:rPr>
+          <w:rFonts w:eastAsiaTheme="minorEastAsia"/>
+        </w:rPr>
+        <w:t xml:space="preserve">as a function of the </w:t>
+      </w:r>
+      <w:r>
+        <w:rPr>
+          <w:rFonts w:eastAsiaTheme="minorEastAsia"/>
+        </w:rPr>
+        <w:t xml:space="preserve">number of threads. This is organized in file </w:t>
+      </w:r>
+      <w:r>
+        <w:rPr>
+          <w:rFonts w:eastAsiaTheme="minorEastAsia"/>
+        </w:rPr>
+        <w:t>measuring</w:t>
+      </w:r>
+      <w:r>
+        <w:rPr>
+          <w:rFonts w:eastAsiaTheme="minorEastAsia"/>
+        </w:rPr>
+        <w:t>/</w:t>
+      </w:r>
+      <w:r>
+        <w:rPr>
+          <w:rFonts w:eastAsiaTheme="minorEastAsia"/>
+        </w:rPr>
+        <w:t>time_parallel_funcs_</w:t>
+      </w:r>
+      <w:r>
+        <w:rPr>
+          <w:rFonts w:eastAsiaTheme="minorEastAsia"/>
+        </w:rPr>
+        <w:t>1.py, where the processes are started in isolation and the warmup is taken into account.</w:t>
+      </w:r>
     </w:p>
     <w:p>
       <w:pPr>
-        <w:rPr>
-          <w:rFonts w:eastAsiaTheme="minorEastAsia"/>
-        </w:rPr>
-      </w:pPr>
-      <w:r>
-        <w:rPr>
-          <w:rFonts w:eastAsiaTheme="minorEastAsia"/>
-        </w:rPr>
-        <w:t xml:space="preserve">The interesting testbench here is to compare the speed-up </w:t>
-      </w:r>
-      <w:r>
-        <w:rPr>
-          <w:rFonts w:eastAsiaTheme="minorEastAsia"/>
-        </w:rPr>
-        <w:t xml:space="preserve">as a function of the </w:t>
-      </w:r>
-      <w:r>
-        <w:rPr>
-          <w:rFonts w:eastAsiaTheme="minorEastAsia"/>
-        </w:rPr>
-        <w:t xml:space="preserve">number of threads. This is organized in file </w:t>
+        <w:jc w:val="center"/>
+        <w:rPr>
+          <w:rFonts w:eastAsiaTheme="minorEastAsia"/>
+        </w:rPr>
+      </w:pPr>
+      <w:r>
+        <w:rPr>
+          <w:noProof/>
+        </w:rPr>
+        <w:drawing>
+          <wp:inline distT="0" distB="0" distL="0" distR="0" wp14:anchorId="3E28A416" wp14:editId="1B811B1B">
+            <wp:extent cx="4248150" cy="2333625"/>
+            <wp:effectExtent l="0" t="0" r="0" b="9525"/>
+            <wp:docPr id="19" name="Chart 19">
+              <a:extLst xmlns:a="http://schemas.openxmlformats.org/drawingml/2006/main">
+                <a:ext uri="{FF2B5EF4-FFF2-40B4-BE49-F238E27FC236}">
+                  <a16:creationId xmlns:a16="http://schemas.microsoft.com/office/drawing/2014/main" id="{CC3A2A29-75AB-4169-B319-D251836F1EE7}"/>
+                </a:ext>
+              </a:extLst>
+            </wp:docPr>
+            <wp:cNvGraphicFramePr/>
+            <a:graphic xmlns:a="http://schemas.openxmlformats.org/drawingml/2006/main">
+              <a:graphicData uri="http://schemas.openxmlformats.org/drawingml/2006/chart">
+                <c:chart xmlns:c="http://schemas.openxmlformats.org/drawingml/2006/chart" xmlns:r="http://schemas.openxmlformats.org/officeDocument/2006/relationships" r:id="rId20"/>
+              </a:graphicData>
+            </a:graphic>
+          </wp:inline>
+        </w:drawing>
+      </w:r>
+    </w:p>
+    <w:p>
+      <w:pPr>
+        <w:jc w:val="center"/>
+        <w:rPr>
+          <w:rFonts w:eastAsiaTheme="minorEastAsia"/>
+          <w:color w:val="808080" w:themeColor="background1" w:themeShade="80"/>
+        </w:rPr>
+      </w:pPr>
+      <w:r>
+        <w:rPr>
+          <w:rFonts w:eastAsiaTheme="minorEastAsia"/>
+          <w:color w:val="808080" w:themeColor="background1" w:themeShade="80"/>
+        </w:rPr>
+        <w:t>Figure 8, Speedup as a function of cores used in the parallelization of the inner loop</w:t>
+      </w:r>
+    </w:p>
+    <w:p>
+      <w:pPr>
+        <w:rPr>
+          <w:rFonts w:eastAsiaTheme="minorEastAsia"/>
+        </w:rPr>
+      </w:pPr>
+      <w:r>
+        <w:rPr>
+          <w:rFonts w:eastAsiaTheme="minorEastAsia"/>
+        </w:rPr>
+        <w:t>We</w:t>
+      </w:r>
+      <w:r>
+        <w:rPr>
+          <w:rFonts w:eastAsiaTheme="minorEastAsia"/>
+        </w:rPr>
+        <w:t xml:space="preserve"> </w:t>
+      </w:r>
+      <w:r>
+        <w:rPr>
+          <w:rFonts w:eastAsiaTheme="minorEastAsia"/>
+        </w:rPr>
+        <w:t xml:space="preserve">see that </w:t>
+      </w:r>
+      <w:r>
+        <w:rPr>
+          <w:rFonts w:eastAsiaTheme="minorEastAsia"/>
+        </w:rPr>
+        <w:t>most of the speed</w:t>
+      </w:r>
+      <w:r>
+        <w:rPr>
+          <w:rFonts w:eastAsiaTheme="minorEastAsia"/>
+        </w:rPr>
+        <w:t>up is achieved when adding a second thread, while more could lead to lost of speedup as the memory throughput is already saturated and is limiting the execution speed.</w:t>
+      </w:r>
+    </w:p>
+    <w:p>
+      <w:pPr>
+        <w:rPr>
+          <w:rFonts w:eastAsiaTheme="minorEastAsia"/>
+          <w:b/>
+          <w:bCs/>
+          <w:sz w:val="32"/>
+          <w:szCs w:val="32"/>
+        </w:rPr>
+      </w:pPr>
+      <w:r>
+        <w:rPr>
+          <w:rFonts w:eastAsiaTheme="minorEastAsia"/>
+          <w:b/>
+          <w:bCs/>
+          <w:sz w:val="32"/>
+          <w:szCs w:val="32"/>
+        </w:rPr>
+        <w:br w:type="page"/>
       </w:r>
     </w:p>
     <w:p>
@@ -13429,6 +14494,7 @@
           <w:sz w:val="32"/>
           <w:szCs w:val="32"/>
         </w:rPr>
+        <w:lastRenderedPageBreak/>
         <w:t xml:space="preserve">Segmented sieve algorithms </w:t>
       </w:r>
     </w:p>
@@ -13651,16 +14717,43 @@
         </w:rPr>
         <w:t xml:space="preserve">] and be followed by </w:t>
       </w:r>
+      <m:oMath>
+        <m:sSub>
+          <m:sSubPr>
+            <m:ctrlPr>
+              <w:rPr>
+                <w:rFonts w:ascii="Cambria Math" w:eastAsiaTheme="minorEastAsia" w:hAnsi="Cambria Math"/>
+                <w:i/>
+              </w:rPr>
+            </m:ctrlPr>
+          </m:sSubPr>
+          <m:e>
+            <m:r>
+              <w:rPr>
+                <w:rFonts w:ascii="Cambria Math" w:eastAsiaTheme="minorEastAsia" w:hAnsi="Cambria Math"/>
+              </w:rPr>
+              <m:t>d</m:t>
+            </m:r>
+          </m:e>
+          <m:sub>
+            <m:r>
+              <w:rPr>
+                <w:rFonts w:ascii="Cambria Math" w:eastAsiaTheme="minorEastAsia" w:hAnsi="Cambria Math"/>
+              </w:rPr>
+              <m:t>1</m:t>
+            </m:r>
+          </m:sub>
+        </m:sSub>
+      </m:oMath>
+      <w:r>
+        <w:rPr>
+          <w:rFonts w:eastAsiaTheme="minorEastAsia"/>
+        </w:rPr>
+        <w:t xml:space="preserve"> new parallel steps of the same size. This is not done in the project for simplicity. The time for this first serial part could be measured directly or observed through the limit of the speedup (via Amdahl’s law).</w:t>
+      </w:r>
     </w:p>
     <w:p>
       <w:pPr>
-        <w:rPr>
-          <w:rFonts w:eastAsiaTheme="minorEastAsia"/>
-        </w:rPr>
-      </w:pPr>
-    </w:p>
-    <w:p>
-      <w:pPr>
         <w:ind w:firstLine="720"/>
         <w:rPr>
           <w:rFonts w:eastAsiaTheme="minorEastAsia"/>
@@ -13670,7 +14763,13 @@
         <w:rPr>
           <w:rFonts w:eastAsiaTheme="minorEastAsia"/>
         </w:rPr>
-        <w:t>Also, for all subsequent version a vectorization of the inner loop will be used as it has no downsides and practically no added complexity.</w:t>
+        <w:t>F</w:t>
+      </w:r>
+      <w:r>
+        <w:rPr>
+          <w:rFonts w:eastAsiaTheme="minorEastAsia"/>
+        </w:rPr>
+        <w:t>or all subsequent version a vectorization of the inner loop will be used as it has no downsides and practically no added complexity.</w:t>
       </w:r>
     </w:p>
     <w:p>
@@ -13715,7 +14814,25 @@
         <w:rPr>
           <w:rFonts w:eastAsiaTheme="minorEastAsia"/>
         </w:rPr>
-        <w:t xml:space="preserve">A function handling a single segment of the sieve, with the needed primes for that segment given as an input is implemented. The primes could be given as a list or a sieve. The list could in theory be smaller and   </w:t>
+        <w:t xml:space="preserve">A function handling a single segment of the sieve, with the needed primes for that segment given as an input is implemented. The primes could be given as a list or a sieve. The list </w:t>
+      </w:r>
+      <w:r>
+        <w:rPr>
+          <w:rFonts w:eastAsiaTheme="minorEastAsia"/>
+        </w:rPr>
+        <w:t>is</w:t>
+      </w:r>
+      <w:r>
+        <w:rPr>
+          <w:rFonts w:eastAsiaTheme="minorEastAsia"/>
+        </w:rPr>
+        <w:t xml:space="preserve"> in theory smaller and </w:t>
+      </w:r>
+      <w:r>
+        <w:rPr>
+          <w:rFonts w:eastAsiaTheme="minorEastAsia"/>
+        </w:rPr>
+        <w:t>also simplifies the algorithm as the primes could be iterated directly.</w:t>
       </w:r>
     </w:p>
     <w:p>
@@ -14451,19 +15568,8 @@
           <w:sz w:val="21"/>
           <w:szCs w:val="21"/>
         </w:rPr>
-        <w:t xml:space="preserve"> </w:t>
-      </w:r>
-      <w:proofErr w:type="gramStart"/>
-      <w:r>
-        <w:rPr>
-          <w:rFonts w:ascii="Consolas" w:eastAsia="Times New Roman" w:hAnsi="Consolas" w:cs="Times New Roman"/>
-          <w:color w:val="657B83"/>
-          <w:sz w:val="21"/>
-          <w:szCs w:val="21"/>
-        </w:rPr>
-        <w:t>d :</w:t>
-      </w:r>
-      <w:proofErr w:type="gramEnd"/>
+        <w:t xml:space="preserve"> d:</w:t>
+      </w:r>
     </w:p>
     <w:p>
       <w:pPr>
@@ -15212,7 +16318,6 @@
           <w:sz w:val="21"/>
           <w:szCs w:val="21"/>
         </w:rPr>
-        <w:lastRenderedPageBreak/>
         <w:t xml:space="preserve">    </w:t>
       </w:r>
       <w:r>
@@ -15453,6 +16558,1420 @@
         </w:rPr>
         <w:t>)</w:t>
       </w:r>
+    </w:p>
+    <w:p>
+      <w:pPr>
+        <w:ind w:firstLine="720"/>
+        <w:rPr>
+          <w:rFonts w:eastAsiaTheme="minorEastAsia"/>
+        </w:rPr>
+      </w:pPr>
+    </w:p>
+    <w:p>
+      <w:pPr>
+        <w:ind w:firstLine="720"/>
+        <w:rPr>
+          <w:rFonts w:eastAsiaTheme="minorEastAsia"/>
+        </w:rPr>
+      </w:pPr>
+      <w:r>
+        <w:rPr>
+          <w:rFonts w:eastAsiaTheme="minorEastAsia"/>
+        </w:rPr>
+        <w:lastRenderedPageBreak/>
+        <w:t xml:space="preserve">This function is then </w:t>
+      </w:r>
+      <w:r>
+        <w:rPr>
+          <w:rFonts w:eastAsiaTheme="minorEastAsia"/>
+        </w:rPr>
+        <w:t>called for each segment (</w:t>
+      </w:r>
+      <w:proofErr w:type="gramStart"/>
+      <w:r>
+        <w:rPr>
+          <w:rFonts w:eastAsiaTheme="minorEastAsia"/>
+        </w:rPr>
+        <w:t>i.e.</w:t>
+      </w:r>
+      <w:proofErr w:type="gramEnd"/>
+      <w:r>
+        <w:rPr>
+          <w:rFonts w:eastAsiaTheme="minorEastAsia"/>
+        </w:rPr>
+        <w:t xml:space="preserve"> </w:t>
+      </w:r>
+      <m:oMath>
+        <m:r>
+          <w:rPr>
+            <w:rFonts w:ascii="Cambria Math" w:eastAsiaTheme="minorEastAsia" w:hAnsi="Cambria Math"/>
+          </w:rPr>
+          <m:t xml:space="preserve"> </m:t>
+        </m:r>
+        <m:f>
+          <m:fPr>
+            <m:ctrlPr>
+              <w:rPr>
+                <w:rFonts w:ascii="Cambria Math" w:eastAsiaTheme="minorEastAsia" w:hAnsi="Cambria Math"/>
+                <w:i/>
+              </w:rPr>
+            </m:ctrlPr>
+          </m:fPr>
+          <m:num>
+            <m:r>
+              <w:rPr>
+                <w:rFonts w:ascii="Cambria Math" w:eastAsiaTheme="minorEastAsia" w:hAnsi="Cambria Math"/>
+              </w:rPr>
+              <m:t>(</m:t>
+            </m:r>
+            <m:sSub>
+              <m:sSubPr>
+                <m:ctrlPr>
+                  <w:rPr>
+                    <w:rFonts w:ascii="Cambria Math" w:eastAsiaTheme="minorEastAsia" w:hAnsi="Cambria Math"/>
+                    <w:i/>
+                  </w:rPr>
+                </m:ctrlPr>
+              </m:sSubPr>
+              <m:e>
+                <m:r>
+                  <w:rPr>
+                    <w:rFonts w:ascii="Cambria Math" w:eastAsiaTheme="minorEastAsia" w:hAnsi="Cambria Math"/>
+                  </w:rPr>
+                  <m:t>N</m:t>
+                </m:r>
+              </m:e>
+              <m:sub>
+                <m:r>
+                  <w:rPr>
+                    <w:rFonts w:ascii="Cambria Math" w:eastAsiaTheme="minorEastAsia" w:hAnsi="Cambria Math"/>
+                  </w:rPr>
+                  <m:t>max</m:t>
+                </m:r>
+              </m:sub>
+            </m:sSub>
+            <m:r>
+              <w:rPr>
+                <w:rFonts w:ascii="Cambria Math" w:eastAsiaTheme="minorEastAsia" w:hAnsi="Cambria Math"/>
+              </w:rPr>
+              <m:t xml:space="preserve">- </m:t>
+            </m:r>
+            <m:rad>
+              <m:radPr>
+                <m:degHide m:val="1"/>
+                <m:ctrlPr>
+                  <w:rPr>
+                    <w:rFonts w:ascii="Cambria Math" w:eastAsiaTheme="minorEastAsia" w:hAnsi="Cambria Math"/>
+                    <w:i/>
+                  </w:rPr>
+                </m:ctrlPr>
+              </m:radPr>
+              <m:deg/>
+              <m:e>
+                <m:sSub>
+                  <m:sSubPr>
+                    <m:ctrlPr>
+                      <w:rPr>
+                        <w:rFonts w:ascii="Cambria Math" w:eastAsiaTheme="minorEastAsia" w:hAnsi="Cambria Math"/>
+                        <w:i/>
+                      </w:rPr>
+                    </m:ctrlPr>
+                  </m:sSubPr>
+                  <m:e>
+                    <m:r>
+                      <w:rPr>
+                        <w:rFonts w:ascii="Cambria Math" w:eastAsiaTheme="minorEastAsia" w:hAnsi="Cambria Math"/>
+                      </w:rPr>
+                      <m:t>N</m:t>
+                    </m:r>
+                  </m:e>
+                  <m:sub>
+                    <m:r>
+                      <w:rPr>
+                        <w:rFonts w:ascii="Cambria Math" w:eastAsiaTheme="minorEastAsia" w:hAnsi="Cambria Math"/>
+                      </w:rPr>
+                      <m:t>max</m:t>
+                    </m:r>
+                  </m:sub>
+                </m:sSub>
+                <m:r>
+                  <w:rPr>
+                    <w:rFonts w:ascii="Cambria Math" w:eastAsiaTheme="minorEastAsia" w:hAnsi="Cambria Math"/>
+                  </w:rPr>
+                  <m:t>)</m:t>
+                </m:r>
+              </m:e>
+            </m:rad>
+          </m:num>
+          <m:den>
+            <m:r>
+              <w:rPr>
+                <w:rFonts w:ascii="Cambria Math" w:eastAsiaTheme="minorEastAsia" w:hAnsi="Cambria Math"/>
+              </w:rPr>
+              <m:t>d</m:t>
+            </m:r>
+          </m:den>
+        </m:f>
+      </m:oMath>
+      <w:r>
+        <w:rPr>
+          <w:rFonts w:eastAsiaTheme="minorEastAsia"/>
+        </w:rPr>
+        <w:t xml:space="preserve"> times) and the outputs are appended to each other. </w:t>
+      </w:r>
+    </w:p>
+    <w:p>
+      <w:pPr>
+        <w:ind w:firstLine="720"/>
+        <w:rPr>
+          <w:rFonts w:eastAsiaTheme="minorEastAsia"/>
+        </w:rPr>
+      </w:pPr>
+    </w:p>
+    <w:p>
+      <w:pPr>
+        <w:shd w:val="clear" w:color="auto" w:fill="FDF6E3"/>
+        <w:spacing w:after="0" w:line="285" w:lineRule="atLeast"/>
+        <w:rPr>
+          <w:rFonts w:ascii="Consolas" w:eastAsia="Times New Roman" w:hAnsi="Consolas" w:cs="Times New Roman"/>
+          <w:color w:val="657B83"/>
+          <w:sz w:val="21"/>
+          <w:szCs w:val="21"/>
+        </w:rPr>
+      </w:pPr>
+      <w:r>
+        <w:rPr>
+          <w:rFonts w:ascii="Consolas" w:eastAsia="Times New Roman" w:hAnsi="Consolas" w:cs="Times New Roman"/>
+          <w:b/>
+          <w:bCs/>
+          <w:color w:val="586E75"/>
+          <w:sz w:val="21"/>
+          <w:szCs w:val="21"/>
+        </w:rPr>
+        <w:t>def</w:t>
+      </w:r>
+      <w:r>
+        <w:rPr>
+          <w:rFonts w:ascii="Consolas" w:eastAsia="Times New Roman" w:hAnsi="Consolas" w:cs="Times New Roman"/>
+          <w:color w:val="657B83"/>
+          <w:sz w:val="21"/>
+          <w:szCs w:val="21"/>
+        </w:rPr>
+        <w:t xml:space="preserve"> </w:t>
+      </w:r>
+      <w:proofErr w:type="spellStart"/>
+      <w:r>
+        <w:rPr>
+          <w:rFonts w:ascii="Consolas" w:eastAsia="Times New Roman" w:hAnsi="Consolas" w:cs="Times New Roman"/>
+          <w:color w:val="268BD2"/>
+          <w:sz w:val="21"/>
+          <w:szCs w:val="21"/>
+        </w:rPr>
+        <w:t>serial_</w:t>
+      </w:r>
+      <w:proofErr w:type="gramStart"/>
+      <w:r>
+        <w:rPr>
+          <w:rFonts w:ascii="Consolas" w:eastAsia="Times New Roman" w:hAnsi="Consolas" w:cs="Times New Roman"/>
+          <w:color w:val="268BD2"/>
+          <w:sz w:val="21"/>
+          <w:szCs w:val="21"/>
+        </w:rPr>
+        <w:t>segmented</w:t>
+      </w:r>
+      <w:proofErr w:type="spellEnd"/>
+      <w:r>
+        <w:rPr>
+          <w:rFonts w:ascii="Consolas" w:eastAsia="Times New Roman" w:hAnsi="Consolas" w:cs="Times New Roman"/>
+          <w:color w:val="657B83"/>
+          <w:sz w:val="21"/>
+          <w:szCs w:val="21"/>
+        </w:rPr>
+        <w:t>(</w:t>
+      </w:r>
+      <w:proofErr w:type="spellStart"/>
+      <w:proofErr w:type="gramEnd"/>
+      <w:r>
+        <w:rPr>
+          <w:rFonts w:ascii="Consolas" w:eastAsia="Times New Roman" w:hAnsi="Consolas" w:cs="Times New Roman"/>
+          <w:color w:val="657B83"/>
+          <w:sz w:val="21"/>
+          <w:szCs w:val="21"/>
+        </w:rPr>
+        <w:t>N_max</w:t>
+      </w:r>
+      <w:proofErr w:type="spellEnd"/>
+      <w:r>
+        <w:rPr>
+          <w:rFonts w:ascii="Consolas" w:eastAsia="Times New Roman" w:hAnsi="Consolas" w:cs="Times New Roman"/>
+          <w:color w:val="657B83"/>
+          <w:sz w:val="21"/>
+          <w:szCs w:val="21"/>
+        </w:rPr>
+        <w:t>, d):</w:t>
+      </w:r>
+    </w:p>
+    <w:p>
+      <w:pPr>
+        <w:shd w:val="clear" w:color="auto" w:fill="FDF6E3"/>
+        <w:spacing w:after="0" w:line="285" w:lineRule="atLeast"/>
+        <w:rPr>
+          <w:rFonts w:ascii="Consolas" w:eastAsia="Times New Roman" w:hAnsi="Consolas" w:cs="Times New Roman"/>
+          <w:color w:val="657B83"/>
+          <w:sz w:val="21"/>
+          <w:szCs w:val="21"/>
+        </w:rPr>
+      </w:pPr>
+      <w:r>
+        <w:rPr>
+          <w:rFonts w:ascii="Consolas" w:eastAsia="Times New Roman" w:hAnsi="Consolas" w:cs="Times New Roman"/>
+          <w:color w:val="657B83"/>
+          <w:sz w:val="21"/>
+          <w:szCs w:val="21"/>
+        </w:rPr>
+        <w:t> </w:t>
+      </w:r>
+    </w:p>
+    <w:p>
+      <w:pPr>
+        <w:shd w:val="clear" w:color="auto" w:fill="FDF6E3"/>
+        <w:spacing w:after="0" w:line="285" w:lineRule="atLeast"/>
+        <w:rPr>
+          <w:rFonts w:ascii="Consolas" w:eastAsia="Times New Roman" w:hAnsi="Consolas" w:cs="Times New Roman"/>
+          <w:color w:val="657B83"/>
+          <w:sz w:val="21"/>
+          <w:szCs w:val="21"/>
+        </w:rPr>
+      </w:pPr>
+      <w:r>
+        <w:rPr>
+          <w:rFonts w:ascii="Consolas" w:eastAsia="Times New Roman" w:hAnsi="Consolas" w:cs="Times New Roman"/>
+          <w:color w:val="657B83"/>
+          <w:sz w:val="21"/>
+          <w:szCs w:val="21"/>
+        </w:rPr>
+        <w:t xml:space="preserve">    </w:t>
+      </w:r>
+      <w:proofErr w:type="spellStart"/>
+      <w:r>
+        <w:rPr>
+          <w:rFonts w:ascii="Consolas" w:eastAsia="Times New Roman" w:hAnsi="Consolas" w:cs="Times New Roman"/>
+          <w:color w:val="268BD2"/>
+          <w:sz w:val="21"/>
+          <w:szCs w:val="21"/>
+        </w:rPr>
+        <w:t>N_sqrt</w:t>
+      </w:r>
+      <w:proofErr w:type="spellEnd"/>
+      <w:r>
+        <w:rPr>
+          <w:rFonts w:ascii="Consolas" w:eastAsia="Times New Roman" w:hAnsi="Consolas" w:cs="Times New Roman"/>
+          <w:color w:val="657B83"/>
+          <w:sz w:val="21"/>
+          <w:szCs w:val="21"/>
+        </w:rPr>
+        <w:t xml:space="preserve"> </w:t>
+      </w:r>
+      <w:r>
+        <w:rPr>
+          <w:rFonts w:ascii="Consolas" w:eastAsia="Times New Roman" w:hAnsi="Consolas" w:cs="Times New Roman"/>
+          <w:color w:val="859900"/>
+          <w:sz w:val="21"/>
+          <w:szCs w:val="21"/>
+        </w:rPr>
+        <w:t>=</w:t>
+      </w:r>
+      <w:r>
+        <w:rPr>
+          <w:rFonts w:ascii="Consolas" w:eastAsia="Times New Roman" w:hAnsi="Consolas" w:cs="Times New Roman"/>
+          <w:color w:val="657B83"/>
+          <w:sz w:val="21"/>
+          <w:szCs w:val="21"/>
+        </w:rPr>
+        <w:t xml:space="preserve"> </w:t>
+      </w:r>
+      <w:proofErr w:type="spellStart"/>
+      <w:proofErr w:type="gramStart"/>
+      <w:r>
+        <w:rPr>
+          <w:rFonts w:ascii="Consolas" w:eastAsia="Times New Roman" w:hAnsi="Consolas" w:cs="Times New Roman"/>
+          <w:color w:val="CB4B16"/>
+          <w:sz w:val="21"/>
+          <w:szCs w:val="21"/>
+        </w:rPr>
+        <w:t>math</w:t>
+      </w:r>
+      <w:r>
+        <w:rPr>
+          <w:rFonts w:ascii="Consolas" w:eastAsia="Times New Roman" w:hAnsi="Consolas" w:cs="Times New Roman"/>
+          <w:color w:val="657B83"/>
+          <w:sz w:val="21"/>
+          <w:szCs w:val="21"/>
+        </w:rPr>
+        <w:t>.</w:t>
+      </w:r>
+      <w:r>
+        <w:rPr>
+          <w:rFonts w:ascii="Consolas" w:eastAsia="Times New Roman" w:hAnsi="Consolas" w:cs="Times New Roman"/>
+          <w:color w:val="268BD2"/>
+          <w:sz w:val="21"/>
+          <w:szCs w:val="21"/>
+        </w:rPr>
+        <w:t>isqrt</w:t>
+      </w:r>
+      <w:proofErr w:type="spellEnd"/>
+      <w:proofErr w:type="gramEnd"/>
+      <w:r>
+        <w:rPr>
+          <w:rFonts w:ascii="Consolas" w:eastAsia="Times New Roman" w:hAnsi="Consolas" w:cs="Times New Roman"/>
+          <w:color w:val="657B83"/>
+          <w:sz w:val="21"/>
+          <w:szCs w:val="21"/>
+        </w:rPr>
+        <w:t>(</w:t>
+      </w:r>
+      <w:proofErr w:type="spellStart"/>
+      <w:r>
+        <w:rPr>
+          <w:rFonts w:ascii="Consolas" w:eastAsia="Times New Roman" w:hAnsi="Consolas" w:cs="Times New Roman"/>
+          <w:color w:val="657B83"/>
+          <w:sz w:val="21"/>
+          <w:szCs w:val="21"/>
+        </w:rPr>
+        <w:t>N_max</w:t>
+      </w:r>
+      <w:proofErr w:type="spellEnd"/>
+      <w:r>
+        <w:rPr>
+          <w:rFonts w:ascii="Consolas" w:eastAsia="Times New Roman" w:hAnsi="Consolas" w:cs="Times New Roman"/>
+          <w:color w:val="657B83"/>
+          <w:sz w:val="21"/>
+          <w:szCs w:val="21"/>
+        </w:rPr>
+        <w:t xml:space="preserve"> </w:t>
+      </w:r>
+      <w:r>
+        <w:rPr>
+          <w:rFonts w:ascii="Consolas" w:eastAsia="Times New Roman" w:hAnsi="Consolas" w:cs="Times New Roman"/>
+          <w:color w:val="859900"/>
+          <w:sz w:val="21"/>
+          <w:szCs w:val="21"/>
+        </w:rPr>
+        <w:t>–</w:t>
+      </w:r>
+      <w:r>
+        <w:rPr>
+          <w:rFonts w:ascii="Consolas" w:eastAsia="Times New Roman" w:hAnsi="Consolas" w:cs="Times New Roman"/>
+          <w:color w:val="657B83"/>
+          <w:sz w:val="21"/>
+          <w:szCs w:val="21"/>
+        </w:rPr>
+        <w:t xml:space="preserve"> </w:t>
+      </w:r>
+      <w:r>
+        <w:rPr>
+          <w:rFonts w:ascii="Consolas" w:eastAsia="Times New Roman" w:hAnsi="Consolas" w:cs="Times New Roman"/>
+          <w:color w:val="D33682"/>
+          <w:sz w:val="21"/>
+          <w:szCs w:val="21"/>
+        </w:rPr>
+        <w:t>1</w:t>
+      </w:r>
+      <w:r>
+        <w:rPr>
+          <w:rFonts w:ascii="Consolas" w:eastAsia="Times New Roman" w:hAnsi="Consolas" w:cs="Times New Roman"/>
+          <w:color w:val="657B83"/>
+          <w:sz w:val="21"/>
+          <w:szCs w:val="21"/>
+        </w:rPr>
+        <w:t>)</w:t>
+      </w:r>
+    </w:p>
+    <w:p>
+      <w:pPr>
+        <w:shd w:val="clear" w:color="auto" w:fill="FDF6E3"/>
+        <w:spacing w:after="0" w:line="285" w:lineRule="atLeast"/>
+        <w:rPr>
+          <w:rFonts w:ascii="Consolas" w:eastAsia="Times New Roman" w:hAnsi="Consolas" w:cs="Times New Roman"/>
+          <w:color w:val="657B83"/>
+          <w:sz w:val="21"/>
+          <w:szCs w:val="21"/>
+        </w:rPr>
+      </w:pPr>
+      <w:r>
+        <w:rPr>
+          <w:rFonts w:ascii="Consolas" w:eastAsia="Times New Roman" w:hAnsi="Consolas" w:cs="Times New Roman"/>
+          <w:color w:val="657B83"/>
+          <w:sz w:val="21"/>
+          <w:szCs w:val="21"/>
+        </w:rPr>
+        <w:t xml:space="preserve">    </w:t>
+      </w:r>
+      <w:r>
+        <w:rPr>
+          <w:rFonts w:ascii="Consolas" w:eastAsia="Times New Roman" w:hAnsi="Consolas" w:cs="Times New Roman"/>
+          <w:color w:val="268BD2"/>
+          <w:sz w:val="21"/>
+          <w:szCs w:val="21"/>
+        </w:rPr>
+        <w:t>seed</w:t>
+      </w:r>
+      <w:r>
+        <w:rPr>
+          <w:rFonts w:ascii="Consolas" w:eastAsia="Times New Roman" w:hAnsi="Consolas" w:cs="Times New Roman"/>
+          <w:color w:val="657B83"/>
+          <w:sz w:val="21"/>
+          <w:szCs w:val="21"/>
+        </w:rPr>
+        <w:t xml:space="preserve"> </w:t>
+      </w:r>
+      <w:r>
+        <w:rPr>
+          <w:rFonts w:ascii="Consolas" w:eastAsia="Times New Roman" w:hAnsi="Consolas" w:cs="Times New Roman"/>
+          <w:color w:val="859900"/>
+          <w:sz w:val="21"/>
+          <w:szCs w:val="21"/>
+        </w:rPr>
+        <w:t>=</w:t>
+      </w:r>
+      <w:r>
+        <w:rPr>
+          <w:rFonts w:ascii="Consolas" w:eastAsia="Times New Roman" w:hAnsi="Consolas" w:cs="Times New Roman"/>
+          <w:color w:val="657B83"/>
+          <w:sz w:val="21"/>
+          <w:szCs w:val="21"/>
+        </w:rPr>
+        <w:t xml:space="preserve"> </w:t>
+      </w:r>
+      <w:proofErr w:type="spellStart"/>
+      <w:r>
+        <w:rPr>
+          <w:rFonts w:ascii="Consolas" w:eastAsia="Times New Roman" w:hAnsi="Consolas" w:cs="Times New Roman"/>
+          <w:color w:val="268BD2"/>
+          <w:sz w:val="21"/>
+          <w:szCs w:val="21"/>
+        </w:rPr>
+        <w:t>serial_</w:t>
+      </w:r>
+      <w:proofErr w:type="gramStart"/>
+      <w:r>
+        <w:rPr>
+          <w:rFonts w:ascii="Consolas" w:eastAsia="Times New Roman" w:hAnsi="Consolas" w:cs="Times New Roman"/>
+          <w:color w:val="268BD2"/>
+          <w:sz w:val="21"/>
+          <w:szCs w:val="21"/>
+        </w:rPr>
+        <w:t>sieve</w:t>
+      </w:r>
+      <w:proofErr w:type="spellEnd"/>
+      <w:r>
+        <w:rPr>
+          <w:rFonts w:ascii="Consolas" w:eastAsia="Times New Roman" w:hAnsi="Consolas" w:cs="Times New Roman"/>
+          <w:color w:val="657B83"/>
+          <w:sz w:val="21"/>
+          <w:szCs w:val="21"/>
+        </w:rPr>
+        <w:t>(</w:t>
+      </w:r>
+      <w:proofErr w:type="spellStart"/>
+      <w:proofErr w:type="gramEnd"/>
+      <w:r>
+        <w:rPr>
+          <w:rFonts w:ascii="Consolas" w:eastAsia="Times New Roman" w:hAnsi="Consolas" w:cs="Times New Roman"/>
+          <w:color w:val="268BD2"/>
+          <w:sz w:val="21"/>
+          <w:szCs w:val="21"/>
+        </w:rPr>
+        <w:t>N_sqrt</w:t>
+      </w:r>
+      <w:proofErr w:type="spellEnd"/>
+      <w:r>
+        <w:rPr>
+          <w:rFonts w:ascii="Consolas" w:eastAsia="Times New Roman" w:hAnsi="Consolas" w:cs="Times New Roman"/>
+          <w:color w:val="657B83"/>
+          <w:sz w:val="21"/>
+          <w:szCs w:val="21"/>
+        </w:rPr>
+        <w:t xml:space="preserve"> </w:t>
+      </w:r>
+      <w:r>
+        <w:rPr>
+          <w:rFonts w:ascii="Consolas" w:eastAsia="Times New Roman" w:hAnsi="Consolas" w:cs="Times New Roman"/>
+          <w:color w:val="859900"/>
+          <w:sz w:val="21"/>
+          <w:szCs w:val="21"/>
+        </w:rPr>
+        <w:t>+</w:t>
+      </w:r>
+      <w:r>
+        <w:rPr>
+          <w:rFonts w:ascii="Consolas" w:eastAsia="Times New Roman" w:hAnsi="Consolas" w:cs="Times New Roman"/>
+          <w:color w:val="657B83"/>
+          <w:sz w:val="21"/>
+          <w:szCs w:val="21"/>
+        </w:rPr>
+        <w:t xml:space="preserve"> </w:t>
+      </w:r>
+      <w:r>
+        <w:rPr>
+          <w:rFonts w:ascii="Consolas" w:eastAsia="Times New Roman" w:hAnsi="Consolas" w:cs="Times New Roman"/>
+          <w:color w:val="D33682"/>
+          <w:sz w:val="21"/>
+          <w:szCs w:val="21"/>
+        </w:rPr>
+        <w:t>1</w:t>
+      </w:r>
+      <w:r>
+        <w:rPr>
+          <w:rFonts w:ascii="Consolas" w:eastAsia="Times New Roman" w:hAnsi="Consolas" w:cs="Times New Roman"/>
+          <w:color w:val="657B83"/>
+          <w:sz w:val="21"/>
+          <w:szCs w:val="21"/>
+        </w:rPr>
+        <w:t>)</w:t>
+      </w:r>
+    </w:p>
+    <w:p>
+      <w:pPr>
+        <w:shd w:val="clear" w:color="auto" w:fill="FDF6E3"/>
+        <w:spacing w:after="0" w:line="285" w:lineRule="atLeast"/>
+        <w:rPr>
+          <w:rFonts w:ascii="Consolas" w:eastAsia="Times New Roman" w:hAnsi="Consolas" w:cs="Times New Roman"/>
+          <w:color w:val="657B83"/>
+          <w:sz w:val="21"/>
+          <w:szCs w:val="21"/>
+        </w:rPr>
+      </w:pPr>
+      <w:r>
+        <w:rPr>
+          <w:rFonts w:ascii="Consolas" w:eastAsia="Times New Roman" w:hAnsi="Consolas" w:cs="Times New Roman"/>
+          <w:color w:val="657B83"/>
+          <w:sz w:val="21"/>
+          <w:szCs w:val="21"/>
+        </w:rPr>
+        <w:t xml:space="preserve">    </w:t>
+      </w:r>
+      <w:r>
+        <w:rPr>
+          <w:rFonts w:ascii="Consolas" w:eastAsia="Times New Roman" w:hAnsi="Consolas" w:cs="Times New Roman"/>
+          <w:color w:val="268BD2"/>
+          <w:sz w:val="21"/>
+          <w:szCs w:val="21"/>
+        </w:rPr>
+        <w:t>chunks</w:t>
+      </w:r>
+      <w:r>
+        <w:rPr>
+          <w:rFonts w:ascii="Consolas" w:eastAsia="Times New Roman" w:hAnsi="Consolas" w:cs="Times New Roman"/>
+          <w:color w:val="657B83"/>
+          <w:sz w:val="21"/>
+          <w:szCs w:val="21"/>
+        </w:rPr>
+        <w:t xml:space="preserve"> </w:t>
+      </w:r>
+      <w:r>
+        <w:rPr>
+          <w:rFonts w:ascii="Consolas" w:eastAsia="Times New Roman" w:hAnsi="Consolas" w:cs="Times New Roman"/>
+          <w:color w:val="859900"/>
+          <w:sz w:val="21"/>
+          <w:szCs w:val="21"/>
+        </w:rPr>
+        <w:t>=</w:t>
+      </w:r>
+      <w:r>
+        <w:rPr>
+          <w:rFonts w:ascii="Consolas" w:eastAsia="Times New Roman" w:hAnsi="Consolas" w:cs="Times New Roman"/>
+          <w:color w:val="657B83"/>
+          <w:sz w:val="21"/>
+          <w:szCs w:val="21"/>
+        </w:rPr>
+        <w:t xml:space="preserve"> [</w:t>
+      </w:r>
+      <w:proofErr w:type="spellStart"/>
+      <w:proofErr w:type="gramStart"/>
+      <w:r>
+        <w:rPr>
+          <w:rFonts w:ascii="Consolas" w:eastAsia="Times New Roman" w:hAnsi="Consolas" w:cs="Times New Roman"/>
+          <w:color w:val="268BD2"/>
+          <w:sz w:val="21"/>
+          <w:szCs w:val="21"/>
+        </w:rPr>
+        <w:t>seed</w:t>
+      </w:r>
+      <w:r>
+        <w:rPr>
+          <w:rFonts w:ascii="Consolas" w:eastAsia="Times New Roman" w:hAnsi="Consolas" w:cs="Times New Roman"/>
+          <w:color w:val="657B83"/>
+          <w:sz w:val="21"/>
+          <w:szCs w:val="21"/>
+        </w:rPr>
+        <w:t>.</w:t>
+      </w:r>
+      <w:r>
+        <w:rPr>
+          <w:rFonts w:ascii="Consolas" w:eastAsia="Times New Roman" w:hAnsi="Consolas" w:cs="Times New Roman"/>
+          <w:color w:val="268BD2"/>
+          <w:sz w:val="21"/>
+          <w:szCs w:val="21"/>
+        </w:rPr>
+        <w:t>astype</w:t>
+      </w:r>
+      <w:proofErr w:type="spellEnd"/>
+      <w:proofErr w:type="gramEnd"/>
+      <w:r>
+        <w:rPr>
+          <w:rFonts w:ascii="Consolas" w:eastAsia="Times New Roman" w:hAnsi="Consolas" w:cs="Times New Roman"/>
+          <w:color w:val="657B83"/>
+          <w:sz w:val="21"/>
+          <w:szCs w:val="21"/>
+        </w:rPr>
+        <w:t>(</w:t>
+      </w:r>
+      <w:r>
+        <w:rPr>
+          <w:rFonts w:ascii="Consolas" w:eastAsia="Times New Roman" w:hAnsi="Consolas" w:cs="Times New Roman"/>
+          <w:color w:val="CB4B16"/>
+          <w:sz w:val="21"/>
+          <w:szCs w:val="21"/>
+        </w:rPr>
+        <w:t>np</w:t>
+      </w:r>
+      <w:r>
+        <w:rPr>
+          <w:rFonts w:ascii="Consolas" w:eastAsia="Times New Roman" w:hAnsi="Consolas" w:cs="Times New Roman"/>
+          <w:color w:val="657B83"/>
+          <w:sz w:val="21"/>
+          <w:szCs w:val="21"/>
+        </w:rPr>
+        <w:t>.</w:t>
+      </w:r>
+      <w:r>
+        <w:rPr>
+          <w:rFonts w:ascii="Consolas" w:eastAsia="Times New Roman" w:hAnsi="Consolas" w:cs="Times New Roman"/>
+          <w:color w:val="CB4B16"/>
+          <w:sz w:val="21"/>
+          <w:szCs w:val="21"/>
+        </w:rPr>
+        <w:t>uint64</w:t>
+      </w:r>
+      <w:r>
+        <w:rPr>
+          <w:rFonts w:ascii="Consolas" w:eastAsia="Times New Roman" w:hAnsi="Consolas" w:cs="Times New Roman"/>
+          <w:color w:val="657B83"/>
+          <w:sz w:val="21"/>
+          <w:szCs w:val="21"/>
+        </w:rPr>
+        <w:t>)]</w:t>
+      </w:r>
+    </w:p>
+    <w:p>
+      <w:pPr>
+        <w:shd w:val="clear" w:color="auto" w:fill="FDF6E3"/>
+        <w:spacing w:after="0" w:line="285" w:lineRule="atLeast"/>
+        <w:rPr>
+          <w:rFonts w:ascii="Consolas" w:eastAsia="Times New Roman" w:hAnsi="Consolas" w:cs="Times New Roman"/>
+          <w:color w:val="657B83"/>
+          <w:sz w:val="21"/>
+          <w:szCs w:val="21"/>
+        </w:rPr>
+      </w:pPr>
+      <w:r>
+        <w:rPr>
+          <w:rFonts w:ascii="Consolas" w:eastAsia="Times New Roman" w:hAnsi="Consolas" w:cs="Times New Roman"/>
+          <w:color w:val="657B83"/>
+          <w:sz w:val="21"/>
+          <w:szCs w:val="21"/>
+        </w:rPr>
+        <w:t xml:space="preserve">    </w:t>
+      </w:r>
+      <w:r>
+        <w:rPr>
+          <w:rFonts w:ascii="Consolas" w:eastAsia="Times New Roman" w:hAnsi="Consolas" w:cs="Times New Roman"/>
+          <w:color w:val="268BD2"/>
+          <w:sz w:val="21"/>
+          <w:szCs w:val="21"/>
+        </w:rPr>
+        <w:t>start</w:t>
+      </w:r>
+      <w:r>
+        <w:rPr>
+          <w:rFonts w:ascii="Consolas" w:eastAsia="Times New Roman" w:hAnsi="Consolas" w:cs="Times New Roman"/>
+          <w:color w:val="657B83"/>
+          <w:sz w:val="21"/>
+          <w:szCs w:val="21"/>
+        </w:rPr>
+        <w:t xml:space="preserve"> </w:t>
+      </w:r>
+      <w:r>
+        <w:rPr>
+          <w:rFonts w:ascii="Consolas" w:eastAsia="Times New Roman" w:hAnsi="Consolas" w:cs="Times New Roman"/>
+          <w:color w:val="859900"/>
+          <w:sz w:val="21"/>
+          <w:szCs w:val="21"/>
+        </w:rPr>
+        <w:t>=</w:t>
+      </w:r>
+      <w:r>
+        <w:rPr>
+          <w:rFonts w:ascii="Consolas" w:eastAsia="Times New Roman" w:hAnsi="Consolas" w:cs="Times New Roman"/>
+          <w:color w:val="657B83"/>
+          <w:sz w:val="21"/>
+          <w:szCs w:val="21"/>
+        </w:rPr>
+        <w:t xml:space="preserve"> </w:t>
+      </w:r>
+      <w:proofErr w:type="spellStart"/>
+      <w:r>
+        <w:rPr>
+          <w:rFonts w:ascii="Consolas" w:eastAsia="Times New Roman" w:hAnsi="Consolas" w:cs="Times New Roman"/>
+          <w:color w:val="268BD2"/>
+          <w:sz w:val="21"/>
+          <w:szCs w:val="21"/>
+        </w:rPr>
+        <w:t>N_sqrt</w:t>
+      </w:r>
+      <w:proofErr w:type="spellEnd"/>
+      <w:r>
+        <w:rPr>
+          <w:rFonts w:ascii="Consolas" w:eastAsia="Times New Roman" w:hAnsi="Consolas" w:cs="Times New Roman"/>
+          <w:color w:val="657B83"/>
+          <w:sz w:val="21"/>
+          <w:szCs w:val="21"/>
+        </w:rPr>
+        <w:t xml:space="preserve"> </w:t>
+      </w:r>
+      <w:r>
+        <w:rPr>
+          <w:rFonts w:ascii="Consolas" w:eastAsia="Times New Roman" w:hAnsi="Consolas" w:cs="Times New Roman"/>
+          <w:color w:val="859900"/>
+          <w:sz w:val="21"/>
+          <w:szCs w:val="21"/>
+        </w:rPr>
+        <w:t>+</w:t>
+      </w:r>
+      <w:r>
+        <w:rPr>
+          <w:rFonts w:ascii="Consolas" w:eastAsia="Times New Roman" w:hAnsi="Consolas" w:cs="Times New Roman"/>
+          <w:color w:val="657B83"/>
+          <w:sz w:val="21"/>
+          <w:szCs w:val="21"/>
+        </w:rPr>
+        <w:t xml:space="preserve"> </w:t>
+      </w:r>
+      <w:r>
+        <w:rPr>
+          <w:rFonts w:ascii="Consolas" w:eastAsia="Times New Roman" w:hAnsi="Consolas" w:cs="Times New Roman"/>
+          <w:color w:val="D33682"/>
+          <w:sz w:val="21"/>
+          <w:szCs w:val="21"/>
+        </w:rPr>
+        <w:t>1</w:t>
+      </w:r>
+    </w:p>
+    <w:p>
+      <w:pPr>
+        <w:shd w:val="clear" w:color="auto" w:fill="FDF6E3"/>
+        <w:spacing w:after="0" w:line="285" w:lineRule="atLeast"/>
+        <w:rPr>
+          <w:rFonts w:ascii="Consolas" w:eastAsia="Times New Roman" w:hAnsi="Consolas" w:cs="Times New Roman"/>
+          <w:color w:val="657B83"/>
+          <w:sz w:val="21"/>
+          <w:szCs w:val="21"/>
+        </w:rPr>
+      </w:pPr>
+      <w:r>
+        <w:rPr>
+          <w:rFonts w:ascii="Consolas" w:eastAsia="Times New Roman" w:hAnsi="Consolas" w:cs="Times New Roman"/>
+          <w:color w:val="657B83"/>
+          <w:sz w:val="21"/>
+          <w:szCs w:val="21"/>
+        </w:rPr>
+        <w:t xml:space="preserve">    </w:t>
+      </w:r>
+      <w:r>
+        <w:rPr>
+          <w:rFonts w:ascii="Consolas" w:eastAsia="Times New Roman" w:hAnsi="Consolas" w:cs="Times New Roman"/>
+          <w:color w:val="859900"/>
+          <w:sz w:val="21"/>
+          <w:szCs w:val="21"/>
+        </w:rPr>
+        <w:t>while</w:t>
+      </w:r>
+      <w:r>
+        <w:rPr>
+          <w:rFonts w:ascii="Consolas" w:eastAsia="Times New Roman" w:hAnsi="Consolas" w:cs="Times New Roman"/>
+          <w:color w:val="657B83"/>
+          <w:sz w:val="21"/>
+          <w:szCs w:val="21"/>
+        </w:rPr>
+        <w:t xml:space="preserve"> </w:t>
+      </w:r>
+      <w:r>
+        <w:rPr>
+          <w:rFonts w:ascii="Consolas" w:eastAsia="Times New Roman" w:hAnsi="Consolas" w:cs="Times New Roman"/>
+          <w:color w:val="268BD2"/>
+          <w:sz w:val="21"/>
+          <w:szCs w:val="21"/>
+        </w:rPr>
+        <w:t>start</w:t>
+      </w:r>
+      <w:r>
+        <w:rPr>
+          <w:rFonts w:ascii="Consolas" w:eastAsia="Times New Roman" w:hAnsi="Consolas" w:cs="Times New Roman"/>
+          <w:color w:val="657B83"/>
+          <w:sz w:val="21"/>
+          <w:szCs w:val="21"/>
+        </w:rPr>
+        <w:t xml:space="preserve"> </w:t>
+      </w:r>
+      <w:r>
+        <w:rPr>
+          <w:rFonts w:ascii="Consolas" w:eastAsia="Times New Roman" w:hAnsi="Consolas" w:cs="Times New Roman"/>
+          <w:color w:val="859900"/>
+          <w:sz w:val="21"/>
+          <w:szCs w:val="21"/>
+        </w:rPr>
+        <w:t>&lt;</w:t>
+      </w:r>
+      <w:r>
+        <w:rPr>
+          <w:rFonts w:ascii="Consolas" w:eastAsia="Times New Roman" w:hAnsi="Consolas" w:cs="Times New Roman"/>
+          <w:color w:val="657B83"/>
+          <w:sz w:val="21"/>
+          <w:szCs w:val="21"/>
+        </w:rPr>
+        <w:t xml:space="preserve"> </w:t>
+      </w:r>
+      <w:proofErr w:type="spellStart"/>
+      <w:r>
+        <w:rPr>
+          <w:rFonts w:ascii="Consolas" w:eastAsia="Times New Roman" w:hAnsi="Consolas" w:cs="Times New Roman"/>
+          <w:color w:val="657B83"/>
+          <w:sz w:val="21"/>
+          <w:szCs w:val="21"/>
+        </w:rPr>
+        <w:t>N_max</w:t>
+      </w:r>
+      <w:proofErr w:type="spellEnd"/>
+      <w:r>
+        <w:rPr>
+          <w:rFonts w:ascii="Consolas" w:eastAsia="Times New Roman" w:hAnsi="Consolas" w:cs="Times New Roman"/>
+          <w:color w:val="657B83"/>
+          <w:sz w:val="21"/>
+          <w:szCs w:val="21"/>
+        </w:rPr>
+        <w:t>:</w:t>
+      </w:r>
+    </w:p>
+    <w:p>
+      <w:pPr>
+        <w:shd w:val="clear" w:color="auto" w:fill="FDF6E3"/>
+        <w:spacing w:after="0" w:line="285" w:lineRule="atLeast"/>
+        <w:rPr>
+          <w:rFonts w:ascii="Consolas" w:eastAsia="Times New Roman" w:hAnsi="Consolas" w:cs="Times New Roman"/>
+          <w:color w:val="657B83"/>
+          <w:sz w:val="21"/>
+          <w:szCs w:val="21"/>
+        </w:rPr>
+      </w:pPr>
+      <w:r>
+        <w:rPr>
+          <w:rFonts w:ascii="Consolas" w:eastAsia="Times New Roman" w:hAnsi="Consolas" w:cs="Times New Roman"/>
+          <w:color w:val="657B83"/>
+          <w:sz w:val="21"/>
+          <w:szCs w:val="21"/>
+        </w:rPr>
+        <w:t xml:space="preserve">        </w:t>
+      </w:r>
+      <w:proofErr w:type="spellStart"/>
+      <w:r>
+        <w:rPr>
+          <w:rFonts w:ascii="Consolas" w:eastAsia="Times New Roman" w:hAnsi="Consolas" w:cs="Times New Roman"/>
+          <w:color w:val="268BD2"/>
+          <w:sz w:val="21"/>
+          <w:szCs w:val="21"/>
+        </w:rPr>
+        <w:t>this_d</w:t>
+      </w:r>
+      <w:proofErr w:type="spellEnd"/>
+      <w:r>
+        <w:rPr>
+          <w:rFonts w:ascii="Consolas" w:eastAsia="Times New Roman" w:hAnsi="Consolas" w:cs="Times New Roman"/>
+          <w:color w:val="657B83"/>
+          <w:sz w:val="21"/>
+          <w:szCs w:val="21"/>
+        </w:rPr>
+        <w:t xml:space="preserve"> </w:t>
+      </w:r>
+      <w:r>
+        <w:rPr>
+          <w:rFonts w:ascii="Consolas" w:eastAsia="Times New Roman" w:hAnsi="Consolas" w:cs="Times New Roman"/>
+          <w:color w:val="859900"/>
+          <w:sz w:val="21"/>
+          <w:szCs w:val="21"/>
+        </w:rPr>
+        <w:t>=</w:t>
+      </w:r>
+      <w:r>
+        <w:rPr>
+          <w:rFonts w:ascii="Consolas" w:eastAsia="Times New Roman" w:hAnsi="Consolas" w:cs="Times New Roman"/>
+          <w:color w:val="657B83"/>
+          <w:sz w:val="21"/>
+          <w:szCs w:val="21"/>
+        </w:rPr>
+        <w:t xml:space="preserve"> </w:t>
+      </w:r>
+      <w:proofErr w:type="gramStart"/>
+      <w:r>
+        <w:rPr>
+          <w:rFonts w:ascii="Consolas" w:eastAsia="Times New Roman" w:hAnsi="Consolas" w:cs="Times New Roman"/>
+          <w:color w:val="268BD2"/>
+          <w:sz w:val="21"/>
+          <w:szCs w:val="21"/>
+        </w:rPr>
+        <w:t>min</w:t>
+      </w:r>
+      <w:r>
+        <w:rPr>
+          <w:rFonts w:ascii="Consolas" w:eastAsia="Times New Roman" w:hAnsi="Consolas" w:cs="Times New Roman"/>
+          <w:color w:val="657B83"/>
+          <w:sz w:val="21"/>
+          <w:szCs w:val="21"/>
+        </w:rPr>
+        <w:t>(</w:t>
+      </w:r>
+      <w:proofErr w:type="gramEnd"/>
+      <w:r>
+        <w:rPr>
+          <w:rFonts w:ascii="Consolas" w:eastAsia="Times New Roman" w:hAnsi="Consolas" w:cs="Times New Roman"/>
+          <w:color w:val="657B83"/>
+          <w:sz w:val="21"/>
+          <w:szCs w:val="21"/>
+        </w:rPr>
+        <w:t xml:space="preserve">d, </w:t>
+      </w:r>
+      <w:proofErr w:type="spellStart"/>
+      <w:r>
+        <w:rPr>
+          <w:rFonts w:ascii="Consolas" w:eastAsia="Times New Roman" w:hAnsi="Consolas" w:cs="Times New Roman"/>
+          <w:color w:val="657B83"/>
+          <w:sz w:val="21"/>
+          <w:szCs w:val="21"/>
+        </w:rPr>
+        <w:t>N_max</w:t>
+      </w:r>
+      <w:proofErr w:type="spellEnd"/>
+      <w:r>
+        <w:rPr>
+          <w:rFonts w:ascii="Consolas" w:eastAsia="Times New Roman" w:hAnsi="Consolas" w:cs="Times New Roman"/>
+          <w:color w:val="657B83"/>
+          <w:sz w:val="21"/>
+          <w:szCs w:val="21"/>
+        </w:rPr>
+        <w:t xml:space="preserve"> </w:t>
+      </w:r>
+      <w:r>
+        <w:rPr>
+          <w:rFonts w:ascii="Consolas" w:eastAsia="Times New Roman" w:hAnsi="Consolas" w:cs="Times New Roman"/>
+          <w:color w:val="859900"/>
+          <w:sz w:val="21"/>
+          <w:szCs w:val="21"/>
+        </w:rPr>
+        <w:t>-</w:t>
+      </w:r>
+      <w:r>
+        <w:rPr>
+          <w:rFonts w:ascii="Consolas" w:eastAsia="Times New Roman" w:hAnsi="Consolas" w:cs="Times New Roman"/>
+          <w:color w:val="657B83"/>
+          <w:sz w:val="21"/>
+          <w:szCs w:val="21"/>
+        </w:rPr>
+        <w:t xml:space="preserve"> </w:t>
+      </w:r>
+      <w:r>
+        <w:rPr>
+          <w:rFonts w:ascii="Consolas" w:eastAsia="Times New Roman" w:hAnsi="Consolas" w:cs="Times New Roman"/>
+          <w:color w:val="268BD2"/>
+          <w:sz w:val="21"/>
+          <w:szCs w:val="21"/>
+        </w:rPr>
+        <w:t>start</w:t>
+      </w:r>
+      <w:r>
+        <w:rPr>
+          <w:rFonts w:ascii="Consolas" w:eastAsia="Times New Roman" w:hAnsi="Consolas" w:cs="Times New Roman"/>
+          <w:color w:val="657B83"/>
+          <w:sz w:val="21"/>
+          <w:szCs w:val="21"/>
+        </w:rPr>
+        <w:t>)  </w:t>
+      </w:r>
+      <w:r>
+        <w:rPr>
+          <w:rFonts w:ascii="Consolas" w:eastAsia="Times New Roman" w:hAnsi="Consolas" w:cs="Times New Roman"/>
+          <w:i/>
+          <w:iCs/>
+          <w:color w:val="93A1A1"/>
+          <w:sz w:val="21"/>
+          <w:szCs w:val="21"/>
+        </w:rPr>
+        <w:t># clip the final</w:t>
+      </w:r>
+    </w:p>
+    <w:p>
+      <w:pPr>
+        <w:shd w:val="clear" w:color="auto" w:fill="FDF6E3"/>
+        <w:spacing w:after="0" w:line="285" w:lineRule="atLeast"/>
+        <w:rPr>
+          <w:rFonts w:ascii="Consolas" w:eastAsia="Times New Roman" w:hAnsi="Consolas" w:cs="Times New Roman"/>
+          <w:color w:val="657B83"/>
+          <w:sz w:val="21"/>
+          <w:szCs w:val="21"/>
+        </w:rPr>
+      </w:pPr>
+      <w:r>
+        <w:rPr>
+          <w:rFonts w:ascii="Consolas" w:eastAsia="Times New Roman" w:hAnsi="Consolas" w:cs="Times New Roman"/>
+          <w:color w:val="657B83"/>
+          <w:sz w:val="21"/>
+          <w:szCs w:val="21"/>
+        </w:rPr>
+        <w:t xml:space="preserve">        </w:t>
+      </w:r>
+      <w:proofErr w:type="spellStart"/>
+      <w:proofErr w:type="gramStart"/>
+      <w:r>
+        <w:rPr>
+          <w:rFonts w:ascii="Consolas" w:eastAsia="Times New Roman" w:hAnsi="Consolas" w:cs="Times New Roman"/>
+          <w:color w:val="268BD2"/>
+          <w:sz w:val="21"/>
+          <w:szCs w:val="21"/>
+        </w:rPr>
+        <w:t>chunks</w:t>
+      </w:r>
+      <w:r>
+        <w:rPr>
+          <w:rFonts w:ascii="Consolas" w:eastAsia="Times New Roman" w:hAnsi="Consolas" w:cs="Times New Roman"/>
+          <w:color w:val="657B83"/>
+          <w:sz w:val="21"/>
+          <w:szCs w:val="21"/>
+        </w:rPr>
+        <w:t>.</w:t>
+      </w:r>
+      <w:r>
+        <w:rPr>
+          <w:rFonts w:ascii="Consolas" w:eastAsia="Times New Roman" w:hAnsi="Consolas" w:cs="Times New Roman"/>
+          <w:color w:val="268BD2"/>
+          <w:sz w:val="21"/>
+          <w:szCs w:val="21"/>
+        </w:rPr>
+        <w:t>append</w:t>
+      </w:r>
+      <w:proofErr w:type="spellEnd"/>
+      <w:proofErr w:type="gramEnd"/>
+      <w:r>
+        <w:rPr>
+          <w:rFonts w:ascii="Consolas" w:eastAsia="Times New Roman" w:hAnsi="Consolas" w:cs="Times New Roman"/>
+          <w:color w:val="657B83"/>
+          <w:sz w:val="21"/>
+          <w:szCs w:val="21"/>
+        </w:rPr>
+        <w:t>(</w:t>
+      </w:r>
+      <w:proofErr w:type="spellStart"/>
+      <w:r>
+        <w:rPr>
+          <w:rFonts w:ascii="Consolas" w:eastAsia="Times New Roman" w:hAnsi="Consolas" w:cs="Times New Roman"/>
+          <w:color w:val="268BD2"/>
+          <w:sz w:val="21"/>
+          <w:szCs w:val="21"/>
+        </w:rPr>
+        <w:t>segment_sieve</w:t>
+      </w:r>
+      <w:proofErr w:type="spellEnd"/>
+      <w:r>
+        <w:rPr>
+          <w:rFonts w:ascii="Consolas" w:eastAsia="Times New Roman" w:hAnsi="Consolas" w:cs="Times New Roman"/>
+          <w:color w:val="657B83"/>
+          <w:sz w:val="21"/>
+          <w:szCs w:val="21"/>
+        </w:rPr>
+        <w:t>(</w:t>
+      </w:r>
+      <w:r>
+        <w:rPr>
+          <w:rFonts w:ascii="Consolas" w:eastAsia="Times New Roman" w:hAnsi="Consolas" w:cs="Times New Roman"/>
+          <w:color w:val="268BD2"/>
+          <w:sz w:val="21"/>
+          <w:szCs w:val="21"/>
+        </w:rPr>
+        <w:t>seed</w:t>
+      </w:r>
+      <w:r>
+        <w:rPr>
+          <w:rFonts w:ascii="Consolas" w:eastAsia="Times New Roman" w:hAnsi="Consolas" w:cs="Times New Roman"/>
+          <w:color w:val="657B83"/>
+          <w:sz w:val="21"/>
+          <w:szCs w:val="21"/>
+        </w:rPr>
+        <w:t xml:space="preserve">, </w:t>
+      </w:r>
+      <w:r>
+        <w:rPr>
+          <w:rFonts w:ascii="Consolas" w:eastAsia="Times New Roman" w:hAnsi="Consolas" w:cs="Times New Roman"/>
+          <w:color w:val="268BD2"/>
+          <w:sz w:val="21"/>
+          <w:szCs w:val="21"/>
+        </w:rPr>
+        <w:t>start</w:t>
+      </w:r>
+      <w:r>
+        <w:rPr>
+          <w:rFonts w:ascii="Consolas" w:eastAsia="Times New Roman" w:hAnsi="Consolas" w:cs="Times New Roman"/>
+          <w:color w:val="657B83"/>
+          <w:sz w:val="21"/>
+          <w:szCs w:val="21"/>
+        </w:rPr>
+        <w:t xml:space="preserve">, </w:t>
+      </w:r>
+      <w:proofErr w:type="spellStart"/>
+      <w:r>
+        <w:rPr>
+          <w:rFonts w:ascii="Consolas" w:eastAsia="Times New Roman" w:hAnsi="Consolas" w:cs="Times New Roman"/>
+          <w:color w:val="268BD2"/>
+          <w:sz w:val="21"/>
+          <w:szCs w:val="21"/>
+        </w:rPr>
+        <w:t>this_d</w:t>
+      </w:r>
+      <w:proofErr w:type="spellEnd"/>
+      <w:r>
+        <w:rPr>
+          <w:rFonts w:ascii="Consolas" w:eastAsia="Times New Roman" w:hAnsi="Consolas" w:cs="Times New Roman"/>
+          <w:color w:val="657B83"/>
+          <w:sz w:val="21"/>
+          <w:szCs w:val="21"/>
+        </w:rPr>
+        <w:t>))</w:t>
+      </w:r>
+    </w:p>
+    <w:p>
+      <w:pPr>
+        <w:shd w:val="clear" w:color="auto" w:fill="FDF6E3"/>
+        <w:spacing w:after="0" w:line="285" w:lineRule="atLeast"/>
+        <w:rPr>
+          <w:rFonts w:ascii="Consolas" w:eastAsia="Times New Roman" w:hAnsi="Consolas" w:cs="Times New Roman"/>
+          <w:color w:val="657B83"/>
+          <w:sz w:val="21"/>
+          <w:szCs w:val="21"/>
+        </w:rPr>
+      </w:pPr>
+      <w:r>
+        <w:rPr>
+          <w:rFonts w:ascii="Consolas" w:eastAsia="Times New Roman" w:hAnsi="Consolas" w:cs="Times New Roman"/>
+          <w:color w:val="657B83"/>
+          <w:sz w:val="21"/>
+          <w:szCs w:val="21"/>
+        </w:rPr>
+        <w:t xml:space="preserve">        </w:t>
+      </w:r>
+      <w:r>
+        <w:rPr>
+          <w:rFonts w:ascii="Consolas" w:eastAsia="Times New Roman" w:hAnsi="Consolas" w:cs="Times New Roman"/>
+          <w:color w:val="268BD2"/>
+          <w:sz w:val="21"/>
+          <w:szCs w:val="21"/>
+        </w:rPr>
+        <w:t>start</w:t>
+      </w:r>
+      <w:r>
+        <w:rPr>
+          <w:rFonts w:ascii="Consolas" w:eastAsia="Times New Roman" w:hAnsi="Consolas" w:cs="Times New Roman"/>
+          <w:color w:val="657B83"/>
+          <w:sz w:val="21"/>
+          <w:szCs w:val="21"/>
+        </w:rPr>
+        <w:t xml:space="preserve"> </w:t>
+      </w:r>
+      <w:r>
+        <w:rPr>
+          <w:rFonts w:ascii="Consolas" w:eastAsia="Times New Roman" w:hAnsi="Consolas" w:cs="Times New Roman"/>
+          <w:color w:val="859900"/>
+          <w:sz w:val="21"/>
+          <w:szCs w:val="21"/>
+        </w:rPr>
+        <w:t>+=</w:t>
+      </w:r>
+      <w:r>
+        <w:rPr>
+          <w:rFonts w:ascii="Consolas" w:eastAsia="Times New Roman" w:hAnsi="Consolas" w:cs="Times New Roman"/>
+          <w:color w:val="657B83"/>
+          <w:sz w:val="21"/>
+          <w:szCs w:val="21"/>
+        </w:rPr>
+        <w:t xml:space="preserve"> </w:t>
+      </w:r>
+      <w:proofErr w:type="spellStart"/>
+      <w:r>
+        <w:rPr>
+          <w:rFonts w:ascii="Consolas" w:eastAsia="Times New Roman" w:hAnsi="Consolas" w:cs="Times New Roman"/>
+          <w:color w:val="268BD2"/>
+          <w:sz w:val="21"/>
+          <w:szCs w:val="21"/>
+        </w:rPr>
+        <w:t>this_d</w:t>
+      </w:r>
+      <w:proofErr w:type="spellEnd"/>
+    </w:p>
+    <w:p>
+      <w:pPr>
+        <w:shd w:val="clear" w:color="auto" w:fill="FDF6E3"/>
+        <w:spacing w:after="0" w:line="285" w:lineRule="atLeast"/>
+        <w:rPr>
+          <w:rFonts w:ascii="Consolas" w:eastAsia="Times New Roman" w:hAnsi="Consolas" w:cs="Times New Roman"/>
+          <w:color w:val="657B83"/>
+          <w:sz w:val="21"/>
+          <w:szCs w:val="21"/>
+        </w:rPr>
+      </w:pPr>
+      <w:r>
+        <w:rPr>
+          <w:rFonts w:ascii="Consolas" w:eastAsia="Times New Roman" w:hAnsi="Consolas" w:cs="Times New Roman"/>
+          <w:color w:val="657B83"/>
+          <w:sz w:val="21"/>
+          <w:szCs w:val="21"/>
+        </w:rPr>
+        <w:t> </w:t>
+      </w:r>
+    </w:p>
+    <w:p>
+      <w:pPr>
+        <w:shd w:val="clear" w:color="auto" w:fill="FDF6E3"/>
+        <w:spacing w:after="0" w:line="285" w:lineRule="atLeast"/>
+        <w:rPr>
+          <w:rFonts w:ascii="Consolas" w:eastAsia="Times New Roman" w:hAnsi="Consolas" w:cs="Times New Roman"/>
+          <w:color w:val="657B83"/>
+          <w:sz w:val="21"/>
+          <w:szCs w:val="21"/>
+        </w:rPr>
+      </w:pPr>
+      <w:r>
+        <w:rPr>
+          <w:rFonts w:ascii="Consolas" w:eastAsia="Times New Roman" w:hAnsi="Consolas" w:cs="Times New Roman"/>
+          <w:color w:val="657B83"/>
+          <w:sz w:val="21"/>
+          <w:szCs w:val="21"/>
+        </w:rPr>
+        <w:t xml:space="preserve">    </w:t>
+      </w:r>
+      <w:r>
+        <w:rPr>
+          <w:rFonts w:ascii="Consolas" w:eastAsia="Times New Roman" w:hAnsi="Consolas" w:cs="Times New Roman"/>
+          <w:color w:val="859900"/>
+          <w:sz w:val="21"/>
+          <w:szCs w:val="21"/>
+        </w:rPr>
+        <w:t>return</w:t>
+      </w:r>
+      <w:r>
+        <w:rPr>
+          <w:rFonts w:ascii="Consolas" w:eastAsia="Times New Roman" w:hAnsi="Consolas" w:cs="Times New Roman"/>
+          <w:color w:val="657B83"/>
+          <w:sz w:val="21"/>
+          <w:szCs w:val="21"/>
+        </w:rPr>
+        <w:t xml:space="preserve"> </w:t>
+      </w:r>
+      <w:proofErr w:type="spellStart"/>
+      <w:proofErr w:type="gramStart"/>
+      <w:r>
+        <w:rPr>
+          <w:rFonts w:ascii="Consolas" w:eastAsia="Times New Roman" w:hAnsi="Consolas" w:cs="Times New Roman"/>
+          <w:color w:val="CB4B16"/>
+          <w:sz w:val="21"/>
+          <w:szCs w:val="21"/>
+        </w:rPr>
+        <w:t>np</w:t>
+      </w:r>
+      <w:r>
+        <w:rPr>
+          <w:rFonts w:ascii="Consolas" w:eastAsia="Times New Roman" w:hAnsi="Consolas" w:cs="Times New Roman"/>
+          <w:color w:val="657B83"/>
+          <w:sz w:val="21"/>
+          <w:szCs w:val="21"/>
+        </w:rPr>
+        <w:t>.</w:t>
+      </w:r>
+      <w:r>
+        <w:rPr>
+          <w:rFonts w:ascii="Consolas" w:eastAsia="Times New Roman" w:hAnsi="Consolas" w:cs="Times New Roman"/>
+          <w:color w:val="268BD2"/>
+          <w:sz w:val="21"/>
+          <w:szCs w:val="21"/>
+        </w:rPr>
+        <w:t>concatenate</w:t>
+      </w:r>
+      <w:proofErr w:type="spellEnd"/>
+      <w:proofErr w:type="gramEnd"/>
+      <w:r>
+        <w:rPr>
+          <w:rFonts w:ascii="Consolas" w:eastAsia="Times New Roman" w:hAnsi="Consolas" w:cs="Times New Roman"/>
+          <w:color w:val="657B83"/>
+          <w:sz w:val="21"/>
+          <w:szCs w:val="21"/>
+        </w:rPr>
+        <w:t>(</w:t>
+      </w:r>
+      <w:r>
+        <w:rPr>
+          <w:rFonts w:ascii="Consolas" w:eastAsia="Times New Roman" w:hAnsi="Consolas" w:cs="Times New Roman"/>
+          <w:color w:val="268BD2"/>
+          <w:sz w:val="21"/>
+          <w:szCs w:val="21"/>
+        </w:rPr>
+        <w:t>chunks</w:t>
+      </w:r>
+      <w:r>
+        <w:rPr>
+          <w:rFonts w:ascii="Consolas" w:eastAsia="Times New Roman" w:hAnsi="Consolas" w:cs="Times New Roman"/>
+          <w:color w:val="657B83"/>
+          <w:sz w:val="21"/>
+          <w:szCs w:val="21"/>
+        </w:rPr>
+        <w:t>)</w:t>
+      </w:r>
+    </w:p>
+    <w:p>
+      <w:pPr>
+        <w:ind w:firstLine="720"/>
+        <w:rPr>
+          <w:rFonts w:eastAsiaTheme="minorEastAsia"/>
+        </w:rPr>
+      </w:pPr>
+    </w:p>
+    <w:p>
+      <w:pPr>
+        <w:ind w:firstLine="720"/>
+        <w:rPr>
+          <w:rFonts w:eastAsiaTheme="minorEastAsia"/>
+        </w:rPr>
+      </w:pPr>
+    </w:p>
+    <w:p>
+      <w:pPr>
+        <w:ind w:firstLine="720"/>
+        <w:rPr>
+          <w:rFonts w:eastAsiaTheme="minorEastAsia"/>
+        </w:rPr>
+      </w:pPr>
+    </w:p>
+    <w:p>
+      <w:pPr>
+        <w:ind w:firstLine="720"/>
+        <w:rPr>
+          <w:rFonts w:eastAsiaTheme="minorEastAsia"/>
+        </w:rPr>
+      </w:pPr>
     </w:p>
     <w:p>
       <w:pPr>
@@ -19170,6 +21689,664 @@
 </c:chartSpace>
 </file>
 
+<file path=word/charts/chart4.xml><?xml version="1.0" encoding="utf-8"?>
+<c:chartSpace xmlns:c="http://schemas.openxmlformats.org/drawingml/2006/chart" xmlns:a="http://schemas.openxmlformats.org/drawingml/2006/main" xmlns:r="http://schemas.openxmlformats.org/officeDocument/2006/relationships" xmlns:c16r2="http://schemas.microsoft.com/office/drawing/2015/06/chart">
+  <c:date1904 val="0"/>
+  <c:lang val="en-US"/>
+  <c:roundedCorners val="0"/>
+  <mc:AlternateContent xmlns:mc="http://schemas.openxmlformats.org/markup-compatibility/2006">
+    <mc:Choice xmlns:c14="http://schemas.microsoft.com/office/drawing/2007/8/2/chart" Requires="c14">
+      <c14:style val="102"/>
+    </mc:Choice>
+    <mc:Fallback>
+      <c:style val="2"/>
+    </mc:Fallback>
+  </mc:AlternateContent>
+  <c:chart>
+    <c:title>
+      <c:tx>
+        <c:rich>
+          <a:bodyPr rot="0" spcFirstLastPara="1" vertOverflow="ellipsis" vert="horz" wrap="square" anchor="ctr" anchorCtr="1"/>
+          <a:lstStyle/>
+          <a:p>
+            <a:pPr>
+              <a:defRPr sz="1400" b="0" i="0" u="none" strike="noStrike" kern="1200" spc="0" baseline="0">
+                <a:solidFill>
+                  <a:schemeClr val="tx1">
+                    <a:lumMod val="65000"/>
+                    <a:lumOff val="35000"/>
+                  </a:schemeClr>
+                </a:solidFill>
+                <a:latin typeface="+mn-lt"/>
+                <a:ea typeface="+mn-ea"/>
+                <a:cs typeface="+mn-cs"/>
+              </a:defRPr>
+            </a:pPr>
+            <a:r>
+              <a:rPr lang="en-US"/>
+              <a:t>Speedup as a function of cores</a:t>
+            </a:r>
+          </a:p>
+        </c:rich>
+      </c:tx>
+      <c:overlay val="0"/>
+      <c:spPr>
+        <a:noFill/>
+        <a:ln>
+          <a:noFill/>
+        </a:ln>
+        <a:effectLst/>
+      </c:spPr>
+      <c:txPr>
+        <a:bodyPr rot="0" spcFirstLastPara="1" vertOverflow="ellipsis" vert="horz" wrap="square" anchor="ctr" anchorCtr="1"/>
+        <a:lstStyle/>
+        <a:p>
+          <a:pPr>
+            <a:defRPr sz="1400" b="0" i="0" u="none" strike="noStrike" kern="1200" spc="0" baseline="0">
+              <a:solidFill>
+                <a:schemeClr val="tx1">
+                  <a:lumMod val="65000"/>
+                  <a:lumOff val="35000"/>
+                </a:schemeClr>
+              </a:solidFill>
+              <a:latin typeface="+mn-lt"/>
+              <a:ea typeface="+mn-ea"/>
+              <a:cs typeface="+mn-cs"/>
+            </a:defRPr>
+          </a:pPr>
+          <a:endParaRPr lang="en-US"/>
+        </a:p>
+      </c:txPr>
+    </c:title>
+    <c:autoTitleDeleted val="0"/>
+    <c:plotArea>
+      <c:layout/>
+      <c:scatterChart>
+        <c:scatterStyle val="lineMarker"/>
+        <c:varyColors val="0"/>
+        <c:ser>
+          <c:idx val="0"/>
+          <c:order val="0"/>
+          <c:tx>
+            <c:v>1GB</c:v>
+          </c:tx>
+          <c:spPr>
+            <a:ln w="19050" cap="rnd">
+              <a:solidFill>
+                <a:schemeClr val="accent1"/>
+              </a:solidFill>
+              <a:round/>
+            </a:ln>
+            <a:effectLst/>
+          </c:spPr>
+          <c:marker>
+            <c:symbol val="circle"/>
+            <c:size val="5"/>
+            <c:spPr>
+              <a:solidFill>
+                <a:schemeClr val="accent1"/>
+              </a:solidFill>
+              <a:ln w="9525">
+                <a:solidFill>
+                  <a:schemeClr val="accent1"/>
+                </a:solidFill>
+              </a:ln>
+              <a:effectLst/>
+            </c:spPr>
+          </c:marker>
+          <c:xVal>
+            <c:numRef>
+              <c:f>'numba_thread_sweep_2026-07-03T1'!$D$30:$D$37</c:f>
+              <c:numCache>
+                <c:formatCode>General</c:formatCode>
+                <c:ptCount val="8"/>
+                <c:pt idx="0">
+                  <c:v>1</c:v>
+                </c:pt>
+                <c:pt idx="1">
+                  <c:v>2</c:v>
+                </c:pt>
+                <c:pt idx="2">
+                  <c:v>3</c:v>
+                </c:pt>
+                <c:pt idx="3">
+                  <c:v>4</c:v>
+                </c:pt>
+                <c:pt idx="4">
+                  <c:v>5</c:v>
+                </c:pt>
+                <c:pt idx="5">
+                  <c:v>6</c:v>
+                </c:pt>
+                <c:pt idx="6">
+                  <c:v>7</c:v>
+                </c:pt>
+                <c:pt idx="7">
+                  <c:v>8</c:v>
+                </c:pt>
+              </c:numCache>
+            </c:numRef>
+          </c:xVal>
+          <c:yVal>
+            <c:numRef>
+              <c:f>'numba_thread_sweep_2026-07-03T1'!$G$30:$G$37</c:f>
+              <c:numCache>
+                <c:formatCode>General</c:formatCode>
+                <c:ptCount val="8"/>
+                <c:pt idx="0">
+                  <c:v>1</c:v>
+                </c:pt>
+                <c:pt idx="1">
+                  <c:v>1.4808839770204301</c:v>
+                </c:pt>
+                <c:pt idx="2">
+                  <c:v>1.49284059768407</c:v>
+                </c:pt>
+                <c:pt idx="3">
+                  <c:v>1.4519555200237899</c:v>
+                </c:pt>
+                <c:pt idx="4">
+                  <c:v>1.47159213765737</c:v>
+                </c:pt>
+                <c:pt idx="5">
+                  <c:v>1.5419937227326399</c:v>
+                </c:pt>
+                <c:pt idx="6">
+                  <c:v>1.67317715074572</c:v>
+                </c:pt>
+                <c:pt idx="7">
+                  <c:v>1.86269965911916</c:v>
+                </c:pt>
+              </c:numCache>
+            </c:numRef>
+          </c:yVal>
+          <c:smooth val="0"/>
+          <c:extLst>
+            <c:ext xmlns:c16="http://schemas.microsoft.com/office/drawing/2014/chart" uri="{C3380CC4-5D6E-409C-BE32-E72D297353CC}">
+              <c16:uniqueId val="{00000000-FA74-4D95-AE58-8D1C4718C543}"/>
+            </c:ext>
+          </c:extLst>
+        </c:ser>
+        <c:ser>
+          <c:idx val="1"/>
+          <c:order val="1"/>
+          <c:tx>
+            <c:v>100MB</c:v>
+          </c:tx>
+          <c:spPr>
+            <a:ln w="19050" cap="rnd">
+              <a:solidFill>
+                <a:schemeClr val="accent2"/>
+              </a:solidFill>
+              <a:round/>
+            </a:ln>
+            <a:effectLst/>
+          </c:spPr>
+          <c:marker>
+            <c:symbol val="circle"/>
+            <c:size val="5"/>
+            <c:spPr>
+              <a:solidFill>
+                <a:schemeClr val="accent2"/>
+              </a:solidFill>
+              <a:ln w="9525">
+                <a:solidFill>
+                  <a:schemeClr val="accent2"/>
+                </a:solidFill>
+              </a:ln>
+              <a:effectLst/>
+            </c:spPr>
+          </c:marker>
+          <c:xVal>
+            <c:numRef>
+              <c:f>'numba_thread_sweep_2026-07-03T1'!$D$30:$D$37</c:f>
+              <c:numCache>
+                <c:formatCode>General</c:formatCode>
+                <c:ptCount val="8"/>
+                <c:pt idx="0">
+                  <c:v>1</c:v>
+                </c:pt>
+                <c:pt idx="1">
+                  <c:v>2</c:v>
+                </c:pt>
+                <c:pt idx="2">
+                  <c:v>3</c:v>
+                </c:pt>
+                <c:pt idx="3">
+                  <c:v>4</c:v>
+                </c:pt>
+                <c:pt idx="4">
+                  <c:v>5</c:v>
+                </c:pt>
+                <c:pt idx="5">
+                  <c:v>6</c:v>
+                </c:pt>
+                <c:pt idx="6">
+                  <c:v>7</c:v>
+                </c:pt>
+                <c:pt idx="7">
+                  <c:v>8</c:v>
+                </c:pt>
+              </c:numCache>
+            </c:numRef>
+          </c:xVal>
+          <c:yVal>
+            <c:numRef>
+              <c:f>'numba_thread_sweep_2026-07-03T1'!$F$30:$F$37</c:f>
+              <c:numCache>
+                <c:formatCode>General</c:formatCode>
+                <c:ptCount val="8"/>
+                <c:pt idx="0">
+                  <c:v>1</c:v>
+                </c:pt>
+                <c:pt idx="1">
+                  <c:v>1.34503978187853</c:v>
+                </c:pt>
+                <c:pt idx="2">
+                  <c:v>1.251675085342</c:v>
+                </c:pt>
+                <c:pt idx="3">
+                  <c:v>1.4146769288790499</c:v>
+                </c:pt>
+                <c:pt idx="4">
+                  <c:v>1.3971630534516299</c:v>
+                </c:pt>
+                <c:pt idx="5">
+                  <c:v>1.30930244822502</c:v>
+                </c:pt>
+                <c:pt idx="6">
+                  <c:v>1.24161427510124</c:v>
+                </c:pt>
+                <c:pt idx="7">
+                  <c:v>1.2940569898505301</c:v>
+                </c:pt>
+              </c:numCache>
+            </c:numRef>
+          </c:yVal>
+          <c:smooth val="0"/>
+          <c:extLst>
+            <c:ext xmlns:c16="http://schemas.microsoft.com/office/drawing/2014/chart" uri="{C3380CC4-5D6E-409C-BE32-E72D297353CC}">
+              <c16:uniqueId val="{00000001-FA74-4D95-AE58-8D1C4718C543}"/>
+            </c:ext>
+          </c:extLst>
+        </c:ser>
+        <c:ser>
+          <c:idx val="3"/>
+          <c:order val="2"/>
+          <c:tx>
+            <c:v>10MB</c:v>
+          </c:tx>
+          <c:spPr>
+            <a:ln w="19050" cap="rnd">
+              <a:solidFill>
+                <a:schemeClr val="accent4"/>
+              </a:solidFill>
+              <a:round/>
+            </a:ln>
+            <a:effectLst/>
+          </c:spPr>
+          <c:marker>
+            <c:symbol val="circle"/>
+            <c:size val="5"/>
+            <c:spPr>
+              <a:solidFill>
+                <a:schemeClr val="accent4"/>
+              </a:solidFill>
+              <a:ln w="9525">
+                <a:solidFill>
+                  <a:schemeClr val="accent4"/>
+                </a:solidFill>
+              </a:ln>
+              <a:effectLst/>
+            </c:spPr>
+          </c:marker>
+          <c:xVal>
+            <c:numRef>
+              <c:f>'numba_thread_sweep_2026-07-03T1'!$D$30:$D$37</c:f>
+              <c:numCache>
+                <c:formatCode>General</c:formatCode>
+                <c:ptCount val="8"/>
+                <c:pt idx="0">
+                  <c:v>1</c:v>
+                </c:pt>
+                <c:pt idx="1">
+                  <c:v>2</c:v>
+                </c:pt>
+                <c:pt idx="2">
+                  <c:v>3</c:v>
+                </c:pt>
+                <c:pt idx="3">
+                  <c:v>4</c:v>
+                </c:pt>
+                <c:pt idx="4">
+                  <c:v>5</c:v>
+                </c:pt>
+                <c:pt idx="5">
+                  <c:v>6</c:v>
+                </c:pt>
+                <c:pt idx="6">
+                  <c:v>7</c:v>
+                </c:pt>
+                <c:pt idx="7">
+                  <c:v>8</c:v>
+                </c:pt>
+              </c:numCache>
+            </c:numRef>
+          </c:xVal>
+          <c:yVal>
+            <c:numRef>
+              <c:f>'numba_thread_sweep_2026-07-03T1'!$E$30:$E$37</c:f>
+              <c:numCache>
+                <c:formatCode>General</c:formatCode>
+                <c:ptCount val="8"/>
+                <c:pt idx="0">
+                  <c:v>1</c:v>
+                </c:pt>
+                <c:pt idx="1">
+                  <c:v>1.4471576087676301</c:v>
+                </c:pt>
+                <c:pt idx="2">
+                  <c:v>1.3590038479117601</c:v>
+                </c:pt>
+                <c:pt idx="3">
+                  <c:v>1.36643995178902</c:v>
+                </c:pt>
+                <c:pt idx="4">
+                  <c:v>1.1113363035288</c:v>
+                </c:pt>
+                <c:pt idx="5">
+                  <c:v>1.2128101034236201</c:v>
+                </c:pt>
+                <c:pt idx="6">
+                  <c:v>1.1042370185685799</c:v>
+                </c:pt>
+                <c:pt idx="7">
+                  <c:v>1.0084406855250101</c:v>
+                </c:pt>
+              </c:numCache>
+            </c:numRef>
+          </c:yVal>
+          <c:smooth val="0"/>
+          <c:extLst>
+            <c:ext xmlns:c16="http://schemas.microsoft.com/office/drawing/2014/chart" uri="{C3380CC4-5D6E-409C-BE32-E72D297353CC}">
+              <c16:uniqueId val="{00000002-FA74-4D95-AE58-8D1C4718C543}"/>
+            </c:ext>
+          </c:extLst>
+        </c:ser>
+        <c:dLbls>
+          <c:showLegendKey val="0"/>
+          <c:showVal val="0"/>
+          <c:showCatName val="0"/>
+          <c:showSerName val="0"/>
+          <c:showPercent val="0"/>
+          <c:showBubbleSize val="0"/>
+        </c:dLbls>
+        <c:axId val="750342064"/>
+        <c:axId val="750341648"/>
+      </c:scatterChart>
+      <c:valAx>
+        <c:axId val="750342064"/>
+        <c:scaling>
+          <c:orientation val="minMax"/>
+          <c:max val="8"/>
+          <c:min val="1"/>
+        </c:scaling>
+        <c:delete val="0"/>
+        <c:axPos val="b"/>
+        <c:majorGridlines>
+          <c:spPr>
+            <a:ln w="9525" cap="flat" cmpd="sng" algn="ctr">
+              <a:solidFill>
+                <a:schemeClr val="tx1">
+                  <a:lumMod val="15000"/>
+                  <a:lumOff val="85000"/>
+                </a:schemeClr>
+              </a:solidFill>
+              <a:round/>
+            </a:ln>
+            <a:effectLst/>
+          </c:spPr>
+        </c:majorGridlines>
+        <c:title>
+          <c:tx>
+            <c:rich>
+              <a:bodyPr rot="0" spcFirstLastPara="1" vertOverflow="ellipsis" vert="horz" wrap="square" anchor="ctr" anchorCtr="1"/>
+              <a:lstStyle/>
+              <a:p>
+                <a:pPr>
+                  <a:defRPr sz="1000" b="0" i="0" u="none" strike="noStrike" kern="1200" baseline="0">
+                    <a:solidFill>
+                      <a:schemeClr val="tx1">
+                        <a:lumMod val="65000"/>
+                        <a:lumOff val="35000"/>
+                      </a:schemeClr>
+                    </a:solidFill>
+                    <a:latin typeface="+mn-lt"/>
+                    <a:ea typeface="+mn-ea"/>
+                    <a:cs typeface="+mn-cs"/>
+                  </a:defRPr>
+                </a:pPr>
+                <a:r>
+                  <a:rPr lang="en-US"/>
+                  <a:t>cores</a:t>
+                </a:r>
+              </a:p>
+            </c:rich>
+          </c:tx>
+          <c:overlay val="0"/>
+          <c:spPr>
+            <a:noFill/>
+            <a:ln>
+              <a:noFill/>
+            </a:ln>
+            <a:effectLst/>
+          </c:spPr>
+          <c:txPr>
+            <a:bodyPr rot="0" spcFirstLastPara="1" vertOverflow="ellipsis" vert="horz" wrap="square" anchor="ctr" anchorCtr="1"/>
+            <a:lstStyle/>
+            <a:p>
+              <a:pPr>
+                <a:defRPr sz="1000" b="0" i="0" u="none" strike="noStrike" kern="1200" baseline="0">
+                  <a:solidFill>
+                    <a:schemeClr val="tx1">
+                      <a:lumMod val="65000"/>
+                      <a:lumOff val="35000"/>
+                    </a:schemeClr>
+                  </a:solidFill>
+                  <a:latin typeface="+mn-lt"/>
+                  <a:ea typeface="+mn-ea"/>
+                  <a:cs typeface="+mn-cs"/>
+                </a:defRPr>
+              </a:pPr>
+              <a:endParaRPr lang="en-US"/>
+            </a:p>
+          </c:txPr>
+        </c:title>
+        <c:numFmt formatCode="General" sourceLinked="1"/>
+        <c:majorTickMark val="none"/>
+        <c:minorTickMark val="none"/>
+        <c:tickLblPos val="nextTo"/>
+        <c:spPr>
+          <a:noFill/>
+          <a:ln w="9525" cap="flat" cmpd="sng" algn="ctr">
+            <a:solidFill>
+              <a:schemeClr val="tx1">
+                <a:lumMod val="25000"/>
+                <a:lumOff val="75000"/>
+              </a:schemeClr>
+            </a:solidFill>
+            <a:round/>
+          </a:ln>
+          <a:effectLst/>
+        </c:spPr>
+        <c:txPr>
+          <a:bodyPr rot="-60000000" spcFirstLastPara="1" vertOverflow="ellipsis" vert="horz" wrap="square" anchor="ctr" anchorCtr="1"/>
+          <a:lstStyle/>
+          <a:p>
+            <a:pPr>
+              <a:defRPr sz="900" b="0" i="0" u="none" strike="noStrike" kern="1200" baseline="0">
+                <a:solidFill>
+                  <a:schemeClr val="tx1">
+                    <a:lumMod val="65000"/>
+                    <a:lumOff val="35000"/>
+                  </a:schemeClr>
+                </a:solidFill>
+                <a:latin typeface="+mn-lt"/>
+                <a:ea typeface="+mn-ea"/>
+                <a:cs typeface="+mn-cs"/>
+              </a:defRPr>
+            </a:pPr>
+            <a:endParaRPr lang="en-US"/>
+          </a:p>
+        </c:txPr>
+        <c:crossAx val="750341648"/>
+        <c:crosses val="autoZero"/>
+        <c:crossBetween val="midCat"/>
+      </c:valAx>
+      <c:valAx>
+        <c:axId val="750341648"/>
+        <c:scaling>
+          <c:orientation val="minMax"/>
+          <c:min val="1"/>
+        </c:scaling>
+        <c:delete val="0"/>
+        <c:axPos val="l"/>
+        <c:majorGridlines>
+          <c:spPr>
+            <a:ln w="9525" cap="flat" cmpd="sng" algn="ctr">
+              <a:solidFill>
+                <a:schemeClr val="tx1">
+                  <a:lumMod val="15000"/>
+                  <a:lumOff val="85000"/>
+                </a:schemeClr>
+              </a:solidFill>
+              <a:round/>
+            </a:ln>
+            <a:effectLst/>
+          </c:spPr>
+        </c:majorGridlines>
+        <c:numFmt formatCode="General" sourceLinked="1"/>
+        <c:majorTickMark val="none"/>
+        <c:minorTickMark val="none"/>
+        <c:tickLblPos val="nextTo"/>
+        <c:spPr>
+          <a:noFill/>
+          <a:ln w="9525" cap="flat" cmpd="sng" algn="ctr">
+            <a:solidFill>
+              <a:schemeClr val="tx1">
+                <a:lumMod val="25000"/>
+                <a:lumOff val="75000"/>
+              </a:schemeClr>
+            </a:solidFill>
+            <a:round/>
+          </a:ln>
+          <a:effectLst/>
+        </c:spPr>
+        <c:txPr>
+          <a:bodyPr rot="-60000000" spcFirstLastPara="1" vertOverflow="ellipsis" vert="horz" wrap="square" anchor="ctr" anchorCtr="1"/>
+          <a:lstStyle/>
+          <a:p>
+            <a:pPr>
+              <a:defRPr sz="900" b="0" i="0" u="none" strike="noStrike" kern="1200" baseline="0">
+                <a:solidFill>
+                  <a:schemeClr val="tx1">
+                    <a:lumMod val="65000"/>
+                    <a:lumOff val="35000"/>
+                  </a:schemeClr>
+                </a:solidFill>
+                <a:latin typeface="+mn-lt"/>
+                <a:ea typeface="+mn-ea"/>
+                <a:cs typeface="+mn-cs"/>
+              </a:defRPr>
+            </a:pPr>
+            <a:endParaRPr lang="en-US"/>
+          </a:p>
+        </c:txPr>
+        <c:crossAx val="750342064"/>
+        <c:crosses val="autoZero"/>
+        <c:crossBetween val="midCat"/>
+      </c:valAx>
+      <c:spPr>
+        <a:noFill/>
+        <a:ln>
+          <a:noFill/>
+        </a:ln>
+        <a:effectLst/>
+      </c:spPr>
+    </c:plotArea>
+    <c:legend>
+      <c:legendPos val="r"/>
+      <c:overlay val="0"/>
+      <c:spPr>
+        <a:noFill/>
+        <a:ln>
+          <a:noFill/>
+        </a:ln>
+        <a:effectLst/>
+      </c:spPr>
+      <c:txPr>
+        <a:bodyPr rot="0" spcFirstLastPara="1" vertOverflow="ellipsis" vert="horz" wrap="square" anchor="ctr" anchorCtr="1"/>
+        <a:lstStyle/>
+        <a:p>
+          <a:pPr>
+            <a:defRPr sz="900" b="0" i="0" u="none" strike="noStrike" kern="1200" baseline="0">
+              <a:solidFill>
+                <a:schemeClr val="tx1">
+                  <a:lumMod val="65000"/>
+                  <a:lumOff val="35000"/>
+                </a:schemeClr>
+              </a:solidFill>
+              <a:latin typeface="+mn-lt"/>
+              <a:ea typeface="+mn-ea"/>
+              <a:cs typeface="+mn-cs"/>
+            </a:defRPr>
+          </a:pPr>
+          <a:endParaRPr lang="en-US"/>
+        </a:p>
+      </c:txPr>
+    </c:legend>
+    <c:plotVisOnly val="1"/>
+    <c:dispBlanksAs val="gap"/>
+    <c:extLst>
+      <c:ext xmlns:c16r3="http://schemas.microsoft.com/office/drawing/2017/03/chart" uri="{56B9EC1D-385E-4148-901F-78D8002777C0}">
+        <c16r3:dataDisplayOptions16>
+          <c16r3:dispNaAsBlank val="1"/>
+        </c16r3:dataDisplayOptions16>
+      </c:ext>
+    </c:extLst>
+    <c:showDLblsOverMax val="0"/>
+  </c:chart>
+  <c:spPr>
+    <a:solidFill>
+      <a:schemeClr val="bg1"/>
+    </a:solidFill>
+    <a:ln w="9525" cap="flat" cmpd="sng" algn="ctr">
+      <a:solidFill>
+        <a:schemeClr val="tx1">
+          <a:lumMod val="15000"/>
+          <a:lumOff val="85000"/>
+        </a:schemeClr>
+      </a:solidFill>
+      <a:round/>
+    </a:ln>
+    <a:effectLst/>
+  </c:spPr>
+  <c:txPr>
+    <a:bodyPr/>
+    <a:lstStyle/>
+    <a:p>
+      <a:pPr>
+        <a:defRPr/>
+      </a:pPr>
+      <a:endParaRPr lang="en-US"/>
+    </a:p>
+  </c:txPr>
+  <c:externalData r:id="rId3">
+    <c:autoUpdate val="0"/>
+  </c:externalData>
+</c:chartSpace>
+</file>
+
 <file path=word/charts/colors1.xml><?xml version="1.0" encoding="utf-8"?>
 <cs:colorStyle xmlns:cs="http://schemas.microsoft.com/office/drawing/2012/chartStyle" xmlns:a="http://schemas.openxmlformats.org/drawingml/2006/main" meth="cycle" id="10">
   <a:schemeClr val="accent1"/>
@@ -19251,6 +22428,46 @@
 </file>
 
 <file path=word/charts/colors3.xml><?xml version="1.0" encoding="utf-8"?>
+<cs:colorStyle xmlns:cs="http://schemas.microsoft.com/office/drawing/2012/chartStyle" xmlns:a="http://schemas.openxmlformats.org/drawingml/2006/main" meth="cycle" id="10">
+  <a:schemeClr val="accent1"/>
+  <a:schemeClr val="accent2"/>
+  <a:schemeClr val="accent3"/>
+  <a:schemeClr val="accent4"/>
+  <a:schemeClr val="accent5"/>
+  <a:schemeClr val="accent6"/>
+  <cs:variation/>
+  <cs:variation>
+    <a:lumMod val="60000"/>
+  </cs:variation>
+  <cs:variation>
+    <a:lumMod val="80000"/>
+    <a:lumOff val="20000"/>
+  </cs:variation>
+  <cs:variation>
+    <a:lumMod val="80000"/>
+  </cs:variation>
+  <cs:variation>
+    <a:lumMod val="60000"/>
+    <a:lumOff val="40000"/>
+  </cs:variation>
+  <cs:variation>
+    <a:lumMod val="50000"/>
+  </cs:variation>
+  <cs:variation>
+    <a:lumMod val="70000"/>
+    <a:lumOff val="30000"/>
+  </cs:variation>
+  <cs:variation>
+    <a:lumMod val="70000"/>
+  </cs:variation>
+  <cs:variation>
+    <a:lumMod val="50000"/>
+    <a:lumOff val="50000"/>
+  </cs:variation>
+</cs:colorStyle>
+</file>
+
+<file path=word/charts/colors4.xml><?xml version="1.0" encoding="utf-8"?>
 <cs:colorStyle xmlns:cs="http://schemas.microsoft.com/office/drawing/2012/chartStyle" xmlns:a="http://schemas.openxmlformats.org/drawingml/2006/main" meth="cycle" id="10">
   <a:schemeClr val="accent1"/>
   <a:schemeClr val="accent2"/>
@@ -20838,6 +24055,522 @@
 </cs:chartStyle>
 </file>
 
+<file path=word/charts/style4.xml><?xml version="1.0" encoding="utf-8"?>
+<cs:chartStyle xmlns:cs="http://schemas.microsoft.com/office/drawing/2012/chartStyle" xmlns:a="http://schemas.openxmlformats.org/drawingml/2006/main" id="240">
+  <cs:axisTitle>
+    <cs:lnRef idx="0"/>
+    <cs:fillRef idx="0"/>
+    <cs:effectRef idx="0"/>
+    <cs:fontRef idx="minor">
+      <a:schemeClr val="tx1">
+        <a:lumMod val="65000"/>
+        <a:lumOff val="35000"/>
+      </a:schemeClr>
+    </cs:fontRef>
+    <cs:defRPr sz="1000" kern="1200"/>
+  </cs:axisTitle>
+  <cs:categoryAxis>
+    <cs:lnRef idx="0"/>
+    <cs:fillRef idx="0"/>
+    <cs:effectRef idx="0"/>
+    <cs:fontRef idx="minor">
+      <a:schemeClr val="tx1">
+        <a:lumMod val="65000"/>
+        <a:lumOff val="35000"/>
+      </a:schemeClr>
+    </cs:fontRef>
+    <cs:spPr>
+      <a:ln w="9525" cap="flat" cmpd="sng" algn="ctr">
+        <a:solidFill>
+          <a:schemeClr val="tx1">
+            <a:lumMod val="25000"/>
+            <a:lumOff val="75000"/>
+          </a:schemeClr>
+        </a:solidFill>
+        <a:round/>
+      </a:ln>
+    </cs:spPr>
+    <cs:defRPr sz="900" kern="1200"/>
+  </cs:categoryAxis>
+  <cs:chartArea mods="allowNoFillOverride allowNoLineOverride">
+    <cs:lnRef idx="0"/>
+    <cs:fillRef idx="0"/>
+    <cs:effectRef idx="0"/>
+    <cs:fontRef idx="minor">
+      <a:schemeClr val="tx1"/>
+    </cs:fontRef>
+    <cs:spPr>
+      <a:solidFill>
+        <a:schemeClr val="bg1"/>
+      </a:solidFill>
+      <a:ln w="9525" cap="flat" cmpd="sng" algn="ctr">
+        <a:solidFill>
+          <a:schemeClr val="tx1">
+            <a:lumMod val="15000"/>
+            <a:lumOff val="85000"/>
+          </a:schemeClr>
+        </a:solidFill>
+        <a:round/>
+      </a:ln>
+    </cs:spPr>
+    <cs:defRPr sz="1000" kern="1200"/>
+  </cs:chartArea>
+  <cs:dataLabel>
+    <cs:lnRef idx="0"/>
+    <cs:fillRef idx="0"/>
+    <cs:effectRef idx="0"/>
+    <cs:fontRef idx="minor">
+      <a:schemeClr val="tx1">
+        <a:lumMod val="75000"/>
+        <a:lumOff val="25000"/>
+      </a:schemeClr>
+    </cs:fontRef>
+    <cs:defRPr sz="900" kern="1200"/>
+  </cs:dataLabel>
+  <cs:dataLabelCallout>
+    <cs:lnRef idx="0"/>
+    <cs:fillRef idx="0"/>
+    <cs:effectRef idx="0"/>
+    <cs:fontRef idx="minor">
+      <a:schemeClr val="dk1">
+        <a:lumMod val="65000"/>
+        <a:lumOff val="35000"/>
+      </a:schemeClr>
+    </cs:fontRef>
+    <cs:spPr>
+      <a:solidFill>
+        <a:schemeClr val="lt1"/>
+      </a:solidFill>
+      <a:ln>
+        <a:solidFill>
+          <a:schemeClr val="dk1">
+            <a:lumMod val="25000"/>
+            <a:lumOff val="75000"/>
+          </a:schemeClr>
+        </a:solidFill>
+      </a:ln>
+    </cs:spPr>
+    <cs:defRPr sz="900" kern="1200"/>
+    <cs:bodyPr rot="0" spcFirstLastPara="1" vertOverflow="clip" horzOverflow="clip" vert="horz" wrap="square" lIns="36576" tIns="18288" rIns="36576" bIns="18288" anchor="ctr" anchorCtr="1">
+      <a:spAutoFit/>
+    </cs:bodyPr>
+  </cs:dataLabelCallout>
+  <cs:dataPoint>
+    <cs:lnRef idx="0"/>
+    <cs:fillRef idx="1">
+      <cs:styleClr val="auto"/>
+    </cs:fillRef>
+    <cs:effectRef idx="0"/>
+    <cs:fontRef idx="minor">
+      <a:schemeClr val="tx1"/>
+    </cs:fontRef>
+  </cs:dataPoint>
+  <cs:dataPoint3D>
+    <cs:lnRef idx="0"/>
+    <cs:fillRef idx="1">
+      <cs:styleClr val="auto"/>
+    </cs:fillRef>
+    <cs:effectRef idx="0"/>
+    <cs:fontRef idx="minor">
+      <a:schemeClr val="tx1"/>
+    </cs:fontRef>
+  </cs:dataPoint3D>
+  <cs:dataPointLine>
+    <cs:lnRef idx="0">
+      <cs:styleClr val="auto"/>
+    </cs:lnRef>
+    <cs:fillRef idx="1"/>
+    <cs:effectRef idx="0"/>
+    <cs:fontRef idx="minor">
+      <a:schemeClr val="tx1"/>
+    </cs:fontRef>
+    <cs:spPr>
+      <a:ln w="19050" cap="rnd">
+        <a:solidFill>
+          <a:schemeClr val="phClr"/>
+        </a:solidFill>
+        <a:round/>
+      </a:ln>
+    </cs:spPr>
+  </cs:dataPointLine>
+  <cs:dataPointMarker>
+    <cs:lnRef idx="0">
+      <cs:styleClr val="auto"/>
+    </cs:lnRef>
+    <cs:fillRef idx="1">
+      <cs:styleClr val="auto"/>
+    </cs:fillRef>
+    <cs:effectRef idx="0"/>
+    <cs:fontRef idx="minor">
+      <a:schemeClr val="tx1"/>
+    </cs:fontRef>
+    <cs:spPr>
+      <a:ln w="9525">
+        <a:solidFill>
+          <a:schemeClr val="phClr"/>
+        </a:solidFill>
+      </a:ln>
+    </cs:spPr>
+  </cs:dataPointMarker>
+  <cs:dataPointMarkerLayout symbol="circle" size="5"/>
+  <cs:dataPointWireframe>
+    <cs:lnRef idx="0">
+      <cs:styleClr val="auto"/>
+    </cs:lnRef>
+    <cs:fillRef idx="0"/>
+    <cs:effectRef idx="0"/>
+    <cs:fontRef idx="minor">
+      <a:schemeClr val="dk1"/>
+    </cs:fontRef>
+    <cs:spPr>
+      <a:ln w="9525" cap="rnd">
+        <a:solidFill>
+          <a:schemeClr val="phClr"/>
+        </a:solidFill>
+        <a:round/>
+      </a:ln>
+    </cs:spPr>
+  </cs:dataPointWireframe>
+  <cs:dataTable>
+    <cs:lnRef idx="0"/>
+    <cs:fillRef idx="0"/>
+    <cs:effectRef idx="0"/>
+    <cs:fontRef idx="minor">
+      <a:schemeClr val="tx1">
+        <a:lumMod val="65000"/>
+        <a:lumOff val="35000"/>
+      </a:schemeClr>
+    </cs:fontRef>
+    <cs:spPr>
+      <a:noFill/>
+      <a:ln w="9525" cap="flat" cmpd="sng" algn="ctr">
+        <a:solidFill>
+          <a:schemeClr val="tx1">
+            <a:lumMod val="15000"/>
+            <a:lumOff val="85000"/>
+          </a:schemeClr>
+        </a:solidFill>
+        <a:round/>
+      </a:ln>
+    </cs:spPr>
+    <cs:defRPr sz="900" kern="1200"/>
+  </cs:dataTable>
+  <cs:downBar>
+    <cs:lnRef idx="0"/>
+    <cs:fillRef idx="0"/>
+    <cs:effectRef idx="0"/>
+    <cs:fontRef idx="minor">
+      <a:schemeClr val="tx1"/>
+    </cs:fontRef>
+    <cs:spPr>
+      <a:solidFill>
+        <a:schemeClr val="dk1">
+          <a:lumMod val="75000"/>
+          <a:lumOff val="25000"/>
+        </a:schemeClr>
+      </a:solidFill>
+      <a:ln w="9525" cap="flat" cmpd="sng" algn="ctr">
+        <a:solidFill>
+          <a:schemeClr val="tx1">
+            <a:lumMod val="65000"/>
+            <a:lumOff val="35000"/>
+          </a:schemeClr>
+        </a:solidFill>
+        <a:round/>
+      </a:ln>
+    </cs:spPr>
+  </cs:downBar>
+  <cs:dropLine>
+    <cs:lnRef idx="0"/>
+    <cs:fillRef idx="0"/>
+    <cs:effectRef idx="0"/>
+    <cs:fontRef idx="minor">
+      <a:schemeClr val="tx1"/>
+    </cs:fontRef>
+    <cs:spPr>
+      <a:ln w="9525" cap="flat" cmpd="sng" algn="ctr">
+        <a:solidFill>
+          <a:schemeClr val="tx1">
+            <a:lumMod val="35000"/>
+            <a:lumOff val="65000"/>
+          </a:schemeClr>
+        </a:solidFill>
+        <a:round/>
+      </a:ln>
+    </cs:spPr>
+  </cs:dropLine>
+  <cs:errorBar>
+    <cs:lnRef idx="0"/>
+    <cs:fillRef idx="0"/>
+    <cs:effectRef idx="0"/>
+    <cs:fontRef idx="minor">
+      <a:schemeClr val="tx1"/>
+    </cs:fontRef>
+    <cs:spPr>
+      <a:ln w="9525" cap="flat" cmpd="sng" algn="ctr">
+        <a:solidFill>
+          <a:schemeClr val="tx1">
+            <a:lumMod val="65000"/>
+            <a:lumOff val="35000"/>
+          </a:schemeClr>
+        </a:solidFill>
+        <a:round/>
+      </a:ln>
+    </cs:spPr>
+  </cs:errorBar>
+  <cs:floor>
+    <cs:lnRef idx="0"/>
+    <cs:fillRef idx="0"/>
+    <cs:effectRef idx="0"/>
+    <cs:fontRef idx="minor">
+      <a:schemeClr val="tx1"/>
+    </cs:fontRef>
+    <cs:spPr>
+      <a:noFill/>
+      <a:ln>
+        <a:noFill/>
+      </a:ln>
+    </cs:spPr>
+  </cs:floor>
+  <cs:gridlineMajor>
+    <cs:lnRef idx="0"/>
+    <cs:fillRef idx="0"/>
+    <cs:effectRef idx="0"/>
+    <cs:fontRef idx="minor">
+      <a:schemeClr val="tx1"/>
+    </cs:fontRef>
+    <cs:spPr>
+      <a:ln w="9525" cap="flat" cmpd="sng" algn="ctr">
+        <a:solidFill>
+          <a:schemeClr val="tx1">
+            <a:lumMod val="15000"/>
+            <a:lumOff val="85000"/>
+          </a:schemeClr>
+        </a:solidFill>
+        <a:round/>
+      </a:ln>
+    </cs:spPr>
+  </cs:gridlineMajor>
+  <cs:gridlineMinor>
+    <cs:lnRef idx="0"/>
+    <cs:fillRef idx="0"/>
+    <cs:effectRef idx="0"/>
+    <cs:fontRef idx="minor">
+      <a:schemeClr val="tx1"/>
+    </cs:fontRef>
+    <cs:spPr>
+      <a:ln w="9525" cap="flat" cmpd="sng" algn="ctr">
+        <a:solidFill>
+          <a:schemeClr val="tx1">
+            <a:lumMod val="5000"/>
+            <a:lumOff val="95000"/>
+          </a:schemeClr>
+        </a:solidFill>
+        <a:round/>
+      </a:ln>
+    </cs:spPr>
+  </cs:gridlineMinor>
+  <cs:hiLoLine>
+    <cs:lnRef idx="0"/>
+    <cs:fillRef idx="0"/>
+    <cs:effectRef idx="0"/>
+    <cs:fontRef idx="minor">
+      <a:schemeClr val="tx1"/>
+    </cs:fontRef>
+    <cs:spPr>
+      <a:ln w="9525" cap="flat" cmpd="sng" algn="ctr">
+        <a:solidFill>
+          <a:schemeClr val="tx1">
+            <a:lumMod val="50000"/>
+            <a:lumOff val="50000"/>
+          </a:schemeClr>
+        </a:solidFill>
+        <a:round/>
+      </a:ln>
+    </cs:spPr>
+  </cs:hiLoLine>
+  <cs:leaderLine>
+    <cs:lnRef idx="0"/>
+    <cs:fillRef idx="0"/>
+    <cs:effectRef idx="0"/>
+    <cs:fontRef idx="minor">
+      <a:schemeClr val="tx1"/>
+    </cs:fontRef>
+    <cs:spPr>
+      <a:ln w="9525" cap="flat" cmpd="sng" algn="ctr">
+        <a:solidFill>
+          <a:schemeClr val="tx1">
+            <a:lumMod val="35000"/>
+            <a:lumOff val="65000"/>
+          </a:schemeClr>
+        </a:solidFill>
+        <a:round/>
+      </a:ln>
+    </cs:spPr>
+  </cs:leaderLine>
+  <cs:legend>
+    <cs:lnRef idx="0"/>
+    <cs:fillRef idx="0"/>
+    <cs:effectRef idx="0"/>
+    <cs:fontRef idx="minor">
+      <a:schemeClr val="tx1">
+        <a:lumMod val="65000"/>
+        <a:lumOff val="35000"/>
+      </a:schemeClr>
+    </cs:fontRef>
+    <cs:defRPr sz="900" kern="1200"/>
+  </cs:legend>
+  <cs:plotArea mods="allowNoFillOverride allowNoLineOverride">
+    <cs:lnRef idx="0"/>
+    <cs:fillRef idx="0"/>
+    <cs:effectRef idx="0"/>
+    <cs:fontRef idx="minor">
+      <a:schemeClr val="tx1"/>
+    </cs:fontRef>
+  </cs:plotArea>
+  <cs:plotArea3D mods="allowNoFillOverride allowNoLineOverride">
+    <cs:lnRef idx="0"/>
+    <cs:fillRef idx="0"/>
+    <cs:effectRef idx="0"/>
+    <cs:fontRef idx="minor">
+      <a:schemeClr val="tx1"/>
+    </cs:fontRef>
+  </cs:plotArea3D>
+  <cs:seriesAxis>
+    <cs:lnRef idx="0"/>
+    <cs:fillRef idx="0"/>
+    <cs:effectRef idx="0"/>
+    <cs:fontRef idx="minor">
+      <a:schemeClr val="tx1">
+        <a:lumMod val="65000"/>
+        <a:lumOff val="35000"/>
+      </a:schemeClr>
+    </cs:fontRef>
+    <cs:defRPr sz="900" kern="1200"/>
+  </cs:seriesAxis>
+  <cs:seriesLine>
+    <cs:lnRef idx="0"/>
+    <cs:fillRef idx="0"/>
+    <cs:effectRef idx="0"/>
+    <cs:fontRef idx="minor">
+      <a:schemeClr val="tx1"/>
+    </cs:fontRef>
+    <cs:spPr>
+      <a:ln w="9525" cap="flat" cmpd="sng" algn="ctr">
+        <a:solidFill>
+          <a:schemeClr val="tx1">
+            <a:lumMod val="35000"/>
+            <a:lumOff val="65000"/>
+          </a:schemeClr>
+        </a:solidFill>
+        <a:round/>
+      </a:ln>
+    </cs:spPr>
+  </cs:seriesLine>
+  <cs:title>
+    <cs:lnRef idx="0"/>
+    <cs:fillRef idx="0"/>
+    <cs:effectRef idx="0"/>
+    <cs:fontRef idx="minor">
+      <a:schemeClr val="tx1">
+        <a:lumMod val="65000"/>
+        <a:lumOff val="35000"/>
+      </a:schemeClr>
+    </cs:fontRef>
+    <cs:defRPr sz="1400" b="0" kern="1200" spc="0" baseline="0"/>
+  </cs:title>
+  <cs:trendline>
+    <cs:lnRef idx="0">
+      <cs:styleClr val="auto"/>
+    </cs:lnRef>
+    <cs:fillRef idx="0"/>
+    <cs:effectRef idx="0"/>
+    <cs:fontRef idx="minor">
+      <a:schemeClr val="tx1"/>
+    </cs:fontRef>
+    <cs:spPr>
+      <a:ln w="19050" cap="rnd">
+        <a:solidFill>
+          <a:schemeClr val="phClr"/>
+        </a:solidFill>
+        <a:prstDash val="sysDot"/>
+      </a:ln>
+    </cs:spPr>
+  </cs:trendline>
+  <cs:trendlineLabel>
+    <cs:lnRef idx="0"/>
+    <cs:fillRef idx="0"/>
+    <cs:effectRef idx="0"/>
+    <cs:fontRef idx="minor">
+      <a:schemeClr val="tx1">
+        <a:lumMod val="65000"/>
+        <a:lumOff val="35000"/>
+      </a:schemeClr>
+    </cs:fontRef>
+    <cs:defRPr sz="900" kern="1200"/>
+  </cs:trendlineLabel>
+  <cs:upBar>
+    <cs:lnRef idx="0"/>
+    <cs:fillRef idx="0"/>
+    <cs:effectRef idx="0"/>
+    <cs:fontRef idx="minor">
+      <a:schemeClr val="tx1"/>
+    </cs:fontRef>
+    <cs:spPr>
+      <a:solidFill>
+        <a:schemeClr val="lt1"/>
+      </a:solidFill>
+      <a:ln w="9525" cap="flat" cmpd="sng" algn="ctr">
+        <a:solidFill>
+          <a:schemeClr val="tx1">
+            <a:lumMod val="65000"/>
+            <a:lumOff val="35000"/>
+          </a:schemeClr>
+        </a:solidFill>
+        <a:round/>
+      </a:ln>
+    </cs:spPr>
+  </cs:upBar>
+  <cs:valueAxis>
+    <cs:lnRef idx="0"/>
+    <cs:fillRef idx="0"/>
+    <cs:effectRef idx="0"/>
+    <cs:fontRef idx="minor">
+      <a:schemeClr val="tx1">
+        <a:lumMod val="65000"/>
+        <a:lumOff val="35000"/>
+      </a:schemeClr>
+    </cs:fontRef>
+    <cs:spPr>
+      <a:ln w="9525" cap="flat" cmpd="sng" algn="ctr">
+        <a:solidFill>
+          <a:schemeClr val="tx1">
+            <a:lumMod val="25000"/>
+            <a:lumOff val="75000"/>
+          </a:schemeClr>
+        </a:solidFill>
+        <a:round/>
+      </a:ln>
+    </cs:spPr>
+    <cs:defRPr sz="900" kern="1200"/>
+  </cs:valueAxis>
+  <cs:wall>
+    <cs:lnRef idx="0"/>
+    <cs:fillRef idx="0"/>
+    <cs:effectRef idx="0"/>
+    <cs:fontRef idx="minor">
+      <a:schemeClr val="tx1"/>
+    </cs:fontRef>
+    <cs:spPr>
+      <a:noFill/>
+      <a:ln>
+        <a:noFill/>
+      </a:ln>
+    </cs:spPr>
+  </cs:wall>
+</cs:chartStyle>
+</file>
+
 <file path=word/theme/theme1.xml><?xml version="1.0" encoding="utf-8"?>
 <a:theme xmlns:a="http://schemas.openxmlformats.org/drawingml/2006/main" name="Office Theme">
   <a:themeElements>

</xml_diff>